<commit_message>
Added Harvard in-text citations
</commit_message>
<xml_diff>
--- a/documents/WEBDEVE PROPOSAL 1.docx
+++ b/documents/WEBDEVE PROPOSAL 1.docx
@@ -1374,7 +1374,7 @@
           <w:szCs w:val="24"/>
           <w:lang w:val="en-US"/>
         </w:rPr>
-        <w:t xml:space="preserve"> is a Cape Town-based startup established in 2026 to disrupt the traditional "queue-based" automotive cleaning industry. As highlighted by </w:t>
+        <w:t xml:space="preserve">  is a Cape Town-based startup established in 2026 to disrupt the traditional "queue-based" automotive cleaning industry. As highlighted by </w:t>
       </w:r>
       <w:r>
         <w:rPr>
@@ -1568,13 +1568,14 @@
           <w:szCs w:val="24"/>
           <w:lang w:val="en-US"/>
         </w:rPr>
-        <w:t xml:space="preserve"> The primary target includes corporate professionals in office complexes and residents in high-security estates who seek luxury convenience.</w:t>
+        <w:t xml:space="preserve"> The primary target includes corporate professionals in office complexes and residents in high-security estates who seek luxury convenience (Nielsen Norman Group, 2025).</w:t>
       </w:r>
     </w:p>
     <w:p>
       <w:pPr>
         <w:pStyle w:val="12"/>
         <w:numPr>
+          <w:ilvl w:val="0"/>
           <w:numId w:val="0"/>
         </w:numPr>
         <w:spacing w:before="240" w:beforeAutospacing="0" w:after="240" w:afterAutospacing="0"/>
@@ -1637,6 +1638,7 @@
       <w:pPr>
         <w:pStyle w:val="12"/>
         <w:numPr>
+          <w:ilvl w:val="0"/>
           <w:numId w:val="0"/>
         </w:numPr>
         <w:spacing w:before="240" w:beforeAutospacing="0" w:after="240" w:afterAutospacing="0"/>
@@ -1704,6 +1706,7 @@
       <w:pPr>
         <w:pStyle w:val="12"/>
         <w:numPr>
+          <w:ilvl w:val="0"/>
           <w:numId w:val="0"/>
         </w:numPr>
         <w:spacing w:before="240" w:beforeAutospacing="0" w:after="240" w:afterAutospacing="0"/>
@@ -1735,6 +1738,7 @@
       <w:pPr>
         <w:pStyle w:val="12"/>
         <w:numPr>
+          <w:ilvl w:val="0"/>
           <w:numId w:val="0"/>
         </w:numPr>
         <w:spacing w:before="240" w:beforeAutospacing="0" w:after="240" w:afterAutospacing="0"/>
@@ -1814,6 +1818,7 @@
       <w:pPr>
         <w:pStyle w:val="12"/>
         <w:numPr>
+          <w:ilvl w:val="0"/>
           <w:numId w:val="0"/>
         </w:numPr>
         <w:spacing w:before="240" w:beforeAutospacing="0" w:after="240" w:afterAutospacing="0"/>
@@ -1833,6 +1838,7 @@
       <w:pPr>
         <w:pStyle w:val="12"/>
         <w:numPr>
+          <w:ilvl w:val="0"/>
           <w:numId w:val="0"/>
         </w:numPr>
         <w:spacing w:before="240" w:beforeAutospacing="0" w:after="240" w:afterAutospacing="0"/>
@@ -1900,6 +1906,7 @@
       <w:pPr>
         <w:pStyle w:val="12"/>
         <w:numPr>
+          <w:ilvl w:val="0"/>
           <w:numId w:val="0"/>
         </w:numPr>
         <w:spacing w:before="240" w:beforeAutospacing="0" w:after="240" w:afterAutospacing="0"/>
@@ -1931,6 +1938,7 @@
       <w:pPr>
         <w:pStyle w:val="12"/>
         <w:numPr>
+          <w:ilvl w:val="0"/>
           <w:numId w:val="0"/>
         </w:numPr>
         <w:spacing w:before="240" w:beforeAutospacing="0" w:after="240" w:afterAutospacing="0"/>
@@ -2010,6 +2018,7 @@
       <w:pPr>
         <w:pStyle w:val="12"/>
         <w:numPr>
+          <w:ilvl w:val="0"/>
           <w:numId w:val="0"/>
         </w:numPr>
         <w:spacing w:before="240" w:beforeAutospacing="0" w:after="240" w:afterAutospacing="0"/>
@@ -2029,6 +2038,7 @@
       <w:pPr>
         <w:pStyle w:val="12"/>
         <w:numPr>
+          <w:ilvl w:val="0"/>
           <w:numId w:val="0"/>
         </w:numPr>
         <w:spacing w:before="240" w:beforeAutospacing="0" w:after="240" w:afterAutospacing="0"/>
@@ -2096,6 +2106,7 @@
       <w:pPr>
         <w:pStyle w:val="12"/>
         <w:numPr>
+          <w:ilvl w:val="0"/>
           <w:numId w:val="0"/>
         </w:numPr>
         <w:spacing w:before="240" w:beforeAutospacing="0" w:after="240" w:afterAutospacing="0"/>
@@ -2127,6 +2138,7 @@
       <w:pPr>
         <w:pStyle w:val="12"/>
         <w:numPr>
+          <w:ilvl w:val="0"/>
           <w:numId w:val="0"/>
         </w:numPr>
         <w:spacing w:before="240" w:beforeAutospacing="0" w:after="240" w:afterAutospacing="0"/>
@@ -2206,6 +2218,7 @@
       <w:pPr>
         <w:pStyle w:val="12"/>
         <w:numPr>
+          <w:ilvl w:val="0"/>
           <w:numId w:val="0"/>
         </w:numPr>
         <w:spacing w:before="240" w:beforeAutospacing="0" w:after="240" w:afterAutospacing="0"/>
@@ -2225,6 +2238,7 @@
       <w:pPr>
         <w:pStyle w:val="12"/>
         <w:numPr>
+          <w:ilvl w:val="0"/>
           <w:numId w:val="0"/>
         </w:numPr>
         <w:spacing w:before="240" w:beforeAutospacing="0" w:after="240" w:afterAutospacing="0"/>
@@ -2292,6 +2306,7 @@
       <w:pPr>
         <w:pStyle w:val="12"/>
         <w:numPr>
+          <w:ilvl w:val="0"/>
           <w:numId w:val="0"/>
         </w:numPr>
         <w:spacing w:before="240" w:beforeAutospacing="0" w:after="240" w:afterAutospacing="0"/>
@@ -2323,6 +2338,7 @@
       <w:pPr>
         <w:pStyle w:val="12"/>
         <w:numPr>
+          <w:ilvl w:val="0"/>
           <w:numId w:val="0"/>
         </w:numPr>
         <w:spacing w:before="240" w:beforeAutospacing="0" w:after="240" w:afterAutospacing="0"/>
@@ -2507,6 +2523,7 @@
       <w:pPr>
         <w:pStyle w:val="12"/>
         <w:numPr>
+          <w:ilvl w:val="0"/>
           <w:numId w:val="0"/>
         </w:numPr>
         <w:spacing w:before="240" w:beforeAutospacing="0" w:after="240" w:afterAutospacing="0"/>
@@ -2544,6 +2561,7 @@
       <w:pPr>
         <w:pStyle w:val="12"/>
         <w:numPr>
+          <w:ilvl w:val="0"/>
           <w:numId w:val="0"/>
         </w:numPr>
         <w:spacing w:before="240" w:beforeAutospacing="0" w:after="240" w:afterAutospacing="0"/>
@@ -2574,13 +2592,14 @@
           <w:szCs w:val="24"/>
           <w:lang w:val="en-US"/>
         </w:rPr>
-        <w:t>he homepage also features a hero image of a vehicle being cleaned to visually communicate the services offered. Below the hero section, service preview cards are displayed to highlight key services such as exterior washing and interior cleaning. The homepage is designed to create a strong first impression and guide users quickly to important sections of the website.</w:t>
+        <w:t>he homepage also features a hero image of a vehicle being cleaned to visually communicate the services offered. Below the hero section, service preview cards are displayed to highlight key services such as exterior washing and interior cleaning. The homepage is designed to create a strong first impression and guide users quickly to important sections of the website (Interaction Design Foundation, 2025)..</w:t>
       </w:r>
     </w:p>
     <w:p>
       <w:pPr>
         <w:pStyle w:val="12"/>
         <w:numPr>
+          <w:ilvl w:val="0"/>
           <w:numId w:val="0"/>
         </w:numPr>
         <w:spacing w:before="240" w:beforeAutospacing="0" w:after="240" w:afterAutospacing="0"/>
@@ -2653,6 +2672,7 @@
       <w:pPr>
         <w:pStyle w:val="12"/>
         <w:numPr>
+          <w:ilvl w:val="0"/>
           <w:numId w:val="0"/>
         </w:numPr>
         <w:spacing w:before="240" w:beforeAutospacing="0" w:after="240" w:afterAutospacing="0"/>
@@ -2690,6 +2710,7 @@
       <w:pPr>
         <w:pStyle w:val="12"/>
         <w:numPr>
+          <w:ilvl w:val="0"/>
           <w:numId w:val="0"/>
         </w:numPr>
         <w:spacing w:before="240" w:beforeAutospacing="0" w:after="240" w:afterAutospacing="0"/>
@@ -2727,6 +2748,7 @@
       <w:pPr>
         <w:pStyle w:val="12"/>
         <w:numPr>
+          <w:ilvl w:val="0"/>
           <w:numId w:val="0"/>
         </w:numPr>
         <w:spacing w:before="240" w:beforeAutospacing="0" w:after="240" w:afterAutospacing="0"/>
@@ -2799,6 +2821,7 @@
       <w:pPr>
         <w:pStyle w:val="12"/>
         <w:numPr>
+          <w:ilvl w:val="0"/>
           <w:numId w:val="0"/>
         </w:numPr>
         <w:spacing w:before="240" w:beforeAutospacing="0" w:after="240" w:afterAutospacing="0"/>
@@ -2826,6 +2849,7 @@
       <w:pPr>
         <w:pStyle w:val="12"/>
         <w:numPr>
+          <w:ilvl w:val="0"/>
           <w:numId w:val="0"/>
         </w:numPr>
         <w:spacing w:before="240" w:beforeAutospacing="0" w:after="240" w:afterAutospacing="0"/>
@@ -2863,6 +2887,7 @@
       <w:pPr>
         <w:pStyle w:val="12"/>
         <w:numPr>
+          <w:ilvl w:val="0"/>
           <w:numId w:val="0"/>
         </w:numPr>
         <w:spacing w:before="240" w:beforeAutospacing="0" w:after="240" w:afterAutospacing="0"/>
@@ -2900,6 +2925,7 @@
       <w:pPr>
         <w:pStyle w:val="12"/>
         <w:numPr>
+          <w:ilvl w:val="0"/>
           <w:numId w:val="0"/>
         </w:numPr>
         <w:spacing w:before="240" w:beforeAutospacing="0" w:after="240" w:afterAutospacing="0"/>
@@ -2937,6 +2963,7 @@
       <w:pPr>
         <w:pStyle w:val="12"/>
         <w:numPr>
+          <w:ilvl w:val="0"/>
           <w:numId w:val="0"/>
         </w:numPr>
         <w:spacing w:before="240" w:beforeAutospacing="0" w:after="240" w:afterAutospacing="0"/>
@@ -2974,6 +3001,7 @@
       <w:pPr>
         <w:pStyle w:val="12"/>
         <w:numPr>
+          <w:ilvl w:val="0"/>
           <w:numId w:val="0"/>
         </w:numPr>
         <w:spacing w:before="240" w:beforeAutospacing="0" w:after="240" w:afterAutospacing="0"/>
@@ -3011,6 +3039,7 @@
       <w:pPr>
         <w:pStyle w:val="12"/>
         <w:numPr>
+          <w:ilvl w:val="0"/>
           <w:numId w:val="0"/>
         </w:numPr>
         <w:spacing w:before="240" w:beforeAutospacing="0" w:after="240" w:afterAutospacing="0"/>
@@ -3048,6 +3077,7 @@
       <w:pPr>
         <w:pStyle w:val="12"/>
         <w:numPr>
+          <w:ilvl w:val="0"/>
           <w:numId w:val="0"/>
         </w:numPr>
         <w:spacing w:before="240" w:beforeAutospacing="0" w:after="240" w:afterAutospacing="0"/>
@@ -3085,6 +3115,7 @@
       <w:pPr>
         <w:pStyle w:val="12"/>
         <w:numPr>
+          <w:ilvl w:val="0"/>
           <w:numId w:val="0"/>
         </w:numPr>
         <w:spacing w:before="240" w:beforeAutospacing="0" w:after="240" w:afterAutospacing="0"/>
@@ -3105,13 +3136,14 @@
           <w:szCs w:val="24"/>
           <w:lang w:val="en-US"/>
         </w:rPr>
-        <w:t>The page may also include service images or icons to improve visual appeal and help customers understand the available options more easily. This section helps customers compare services and choose the package that best suits their needs.</w:t>
+        <w:t>The page may also include service images or icons to improve visual appeal and help customers understand the available options more easily (Adobe, 2025). This section helps customers compare services and choose the package that best suits their needs.</w:t>
       </w:r>
     </w:p>
     <w:p>
       <w:pPr>
         <w:pStyle w:val="12"/>
         <w:numPr>
+          <w:ilvl w:val="0"/>
           <w:numId w:val="0"/>
         </w:numPr>
         <w:spacing w:before="240" w:beforeAutospacing="0" w:after="240" w:afterAutospacing="0"/>
@@ -3129,6 +3161,7 @@
       <w:pPr>
         <w:pStyle w:val="12"/>
         <w:numPr>
+          <w:ilvl w:val="0"/>
           <w:numId w:val="0"/>
         </w:numPr>
         <w:spacing w:before="240" w:beforeAutospacing="0" w:after="240" w:afterAutospacing="0"/>
@@ -3146,6 +3179,7 @@
       <w:pPr>
         <w:pStyle w:val="12"/>
         <w:numPr>
+          <w:ilvl w:val="0"/>
           <w:numId w:val="0"/>
         </w:numPr>
         <w:spacing w:before="240" w:beforeAutospacing="0" w:after="240" w:afterAutospacing="0"/>
@@ -3218,6 +3252,7 @@
       <w:pPr>
         <w:pStyle w:val="12"/>
         <w:numPr>
+          <w:ilvl w:val="0"/>
           <w:numId w:val="0"/>
         </w:numPr>
         <w:spacing w:before="240" w:beforeAutospacing="0" w:after="240" w:afterAutospacing="0"/>
@@ -3245,6 +3280,7 @@
       <w:pPr>
         <w:pStyle w:val="12"/>
         <w:numPr>
+          <w:ilvl w:val="0"/>
           <w:numId w:val="0"/>
         </w:numPr>
         <w:spacing w:before="240" w:beforeAutospacing="0" w:after="240" w:afterAutospacing="0"/>
@@ -3272,6 +3308,7 @@
       <w:pPr>
         <w:pStyle w:val="12"/>
         <w:numPr>
+          <w:ilvl w:val="0"/>
           <w:numId w:val="0"/>
         </w:numPr>
         <w:spacing w:before="240" w:beforeAutospacing="0" w:after="240" w:afterAutospacing="0"/>
@@ -3309,6 +3346,7 @@
       <w:pPr>
         <w:pStyle w:val="12"/>
         <w:numPr>
+          <w:ilvl w:val="0"/>
           <w:numId w:val="0"/>
         </w:numPr>
         <w:spacing w:before="240" w:beforeAutospacing="0" w:after="240" w:afterAutospacing="0"/>
@@ -3346,6 +3384,7 @@
       <w:pPr>
         <w:pStyle w:val="12"/>
         <w:numPr>
+          <w:ilvl w:val="0"/>
           <w:numId w:val="0"/>
         </w:numPr>
         <w:spacing w:before="240" w:beforeAutospacing="0" w:after="240" w:afterAutospacing="0"/>
@@ -3383,6 +3422,7 @@
       <w:pPr>
         <w:pStyle w:val="12"/>
         <w:numPr>
+          <w:ilvl w:val="0"/>
           <w:numId w:val="0"/>
         </w:numPr>
         <w:spacing w:before="240" w:beforeAutospacing="0" w:after="240" w:afterAutospacing="0"/>
@@ -3420,6 +3460,7 @@
       <w:pPr>
         <w:pStyle w:val="12"/>
         <w:numPr>
+          <w:ilvl w:val="0"/>
           <w:numId w:val="0"/>
         </w:numPr>
         <w:spacing w:before="240" w:beforeAutospacing="0" w:after="240" w:afterAutospacing="0"/>
@@ -3457,6 +3498,7 @@
       <w:pPr>
         <w:pStyle w:val="12"/>
         <w:numPr>
+          <w:ilvl w:val="0"/>
           <w:numId w:val="0"/>
         </w:numPr>
         <w:spacing w:before="240" w:beforeAutospacing="0" w:after="240" w:afterAutospacing="0"/>
@@ -3494,6 +3536,7 @@
       <w:pPr>
         <w:pStyle w:val="12"/>
         <w:numPr>
+          <w:ilvl w:val="0"/>
           <w:numId w:val="0"/>
         </w:numPr>
         <w:spacing w:before="240" w:beforeAutospacing="0" w:after="240" w:afterAutospacing="0"/>
@@ -3514,13 +3557,69 @@
           <w:szCs w:val="24"/>
           <w:lang w:val="en-US"/>
         </w:rPr>
-        <w:t>The “Book Now” button displayed on the homepage links directly to this page. The goal of the booking system is to reduce booking time and improve customer convenience by allowing users to make appointments without phone calls or physical visits.</w:t>
+        <w:t>The “Book Now” button displayed on the homepage links directly to this page. The goal of the booking system is to reduce booking time and improve customer convenience by allowing users to make appointments without phone calls or physical visits (Smashing Magazine, 2025).</w:t>
       </w:r>
     </w:p>
     <w:p>
       <w:pPr>
         <w:pStyle w:val="12"/>
         <w:numPr>
+          <w:ilvl w:val="0"/>
+          <w:numId w:val="6"/>
+        </w:numPr>
+        <w:spacing w:before="240" w:beforeAutospacing="0" w:after="240" w:afterAutospacing="0"/>
+        <w:rPr>
+          <w:rFonts w:hint="default" w:ascii="Times New Roman" w:hAnsi="Times New Roman" w:cs="Times New Roman"/>
+          <w:b/>
+          <w:bCs/>
+          <w:color w:val="auto"/>
+          <w:sz w:val="24"/>
+          <w:szCs w:val="24"/>
+          <w:lang w:val="en-US"/>
+        </w:rPr>
+      </w:pPr>
+      <w:r>
+        <w:rPr>
+          <w:rFonts w:hint="default" w:ascii="Times New Roman" w:hAnsi="Times New Roman" w:cs="Times New Roman"/>
+          <w:b/>
+          <w:bCs/>
+          <w:color w:val="auto"/>
+          <w:sz w:val="24"/>
+          <w:szCs w:val="24"/>
+          <w:lang w:val="en-ZA"/>
+        </w:rPr>
+        <w:t xml:space="preserve">3.5. </w:t>
+      </w:r>
+      <w:r>
+        <w:rPr>
+          <w:rFonts w:hint="default" w:ascii="Times New Roman" w:hAnsi="Times New Roman" w:cs="Times New Roman"/>
+          <w:b/>
+          <w:bCs/>
+          <w:color w:val="auto"/>
+          <w:sz w:val="24"/>
+          <w:szCs w:val="24"/>
+          <w:lang w:val="en-US"/>
+        </w:rPr>
+        <w:t xml:space="preserve">Contact </w:t>
+      </w:r>
+      <w:r>
+        <w:rPr>
+          <w:rFonts w:hint="default" w:ascii="Times New Roman" w:hAnsi="Times New Roman" w:cs="Times New Roman"/>
+          <w:b/>
+          <w:bCs/>
+          <w:color w:val="auto"/>
+          <w:sz w:val="24"/>
+          <w:szCs w:val="24"/>
+          <w:lang w:val="en-ZA"/>
+        </w:rPr>
+        <w:t>page</w:t>
+      </w:r>
+    </w:p>
+    <w:p>
+      <w:pPr>
+        <w:pStyle w:val="12"/>
+        <w:numPr>
+          <w:ilvl w:val="0"/>
           <w:numId w:val="0"/>
         </w:numPr>
         <w:spacing w:before="240" w:beforeAutospacing="0" w:after="240" w:afterAutospacing="0"/>
@@ -3533,6 +3632,384 @@
           <w:lang w:val="en-US"/>
         </w:rPr>
       </w:pPr>
+      <w:r>
+        <w:rPr>
+          <w:rFonts w:hint="default" w:ascii="Times New Roman" w:hAnsi="Times New Roman" w:cs="Times New Roman"/>
+          <w:color w:val="auto"/>
+          <w:sz w:val="24"/>
+          <w:szCs w:val="24"/>
+          <w:lang w:val="en-US"/>
+        </w:rPr>
+        <w:t>The Contact page provides important communication details for customers who may want to ask questions or request additional information.</w:t>
+      </w:r>
+    </w:p>
+    <w:p>
+      <w:pPr>
+        <w:pStyle w:val="12"/>
+        <w:numPr>
+          <w:ilvl w:val="0"/>
+          <w:numId w:val="0"/>
+        </w:numPr>
+        <w:spacing w:before="240" w:beforeAutospacing="0" w:after="240" w:afterAutospacing="0"/>
+        <w:ind w:left="360" w:leftChars="0"/>
+        <w:rPr>
+          <w:rFonts w:hint="default" w:ascii="Times New Roman" w:hAnsi="Times New Roman" w:cs="Times New Roman"/>
+          <w:color w:val="auto"/>
+          <w:sz w:val="24"/>
+          <w:szCs w:val="24"/>
+          <w:lang w:val="en-US"/>
+        </w:rPr>
+      </w:pPr>
+      <w:r>
+        <w:rPr>
+          <w:rFonts w:hint="default" w:ascii="Times New Roman" w:hAnsi="Times New Roman" w:cs="Times New Roman"/>
+          <w:color w:val="auto"/>
+          <w:sz w:val="24"/>
+          <w:szCs w:val="24"/>
+          <w:lang w:val="en-US"/>
+        </w:rPr>
+        <w:t>The page includes:</w:t>
+      </w:r>
+    </w:p>
+    <w:p>
+      <w:pPr>
+        <w:pStyle w:val="12"/>
+        <w:numPr>
+          <w:ilvl w:val="0"/>
+          <w:numId w:val="0"/>
+        </w:numPr>
+        <w:spacing w:before="240" w:beforeAutospacing="0" w:after="240" w:afterAutospacing="0"/>
+        <w:ind w:left="360" w:leftChars="0" w:firstLine="716" w:firstLineChars="0"/>
+        <w:rPr>
+          <w:rFonts w:hint="default" w:ascii="Times New Roman" w:hAnsi="Times New Roman" w:cs="Times New Roman"/>
+          <w:color w:val="auto"/>
+          <w:sz w:val="24"/>
+          <w:szCs w:val="24"/>
+          <w:lang w:val="en-US"/>
+        </w:rPr>
+      </w:pPr>
+      <w:r>
+        <w:rPr>
+          <w:rFonts w:hint="default" w:ascii="Times New Roman" w:hAnsi="Times New Roman" w:cs="Times New Roman"/>
+          <w:color w:val="auto"/>
+          <w:sz w:val="24"/>
+          <w:szCs w:val="24"/>
+          <w:lang w:val="en-ZA"/>
+        </w:rPr>
+        <w:t>-</w:t>
+      </w:r>
+      <w:r>
+        <w:rPr>
+          <w:rFonts w:hint="default" w:ascii="Times New Roman" w:hAnsi="Times New Roman" w:cs="Times New Roman"/>
+          <w:color w:val="auto"/>
+          <w:sz w:val="24"/>
+          <w:szCs w:val="24"/>
+          <w:lang w:val="en-US"/>
+        </w:rPr>
+        <w:t xml:space="preserve">Business phone number </w:t>
+      </w:r>
+    </w:p>
+    <w:p>
+      <w:pPr>
+        <w:pStyle w:val="12"/>
+        <w:numPr>
+          <w:ilvl w:val="0"/>
+          <w:numId w:val="0"/>
+        </w:numPr>
+        <w:spacing w:before="240" w:beforeAutospacing="0" w:after="240" w:afterAutospacing="0"/>
+        <w:ind w:left="360" w:leftChars="0" w:firstLine="716" w:firstLineChars="0"/>
+        <w:rPr>
+          <w:rFonts w:hint="default" w:ascii="Times New Roman" w:hAnsi="Times New Roman" w:cs="Times New Roman"/>
+          <w:color w:val="auto"/>
+          <w:sz w:val="24"/>
+          <w:szCs w:val="24"/>
+          <w:lang w:val="en-US"/>
+        </w:rPr>
+      </w:pPr>
+      <w:r>
+        <w:rPr>
+          <w:rFonts w:hint="default" w:ascii="Times New Roman" w:hAnsi="Times New Roman" w:cs="Times New Roman"/>
+          <w:color w:val="auto"/>
+          <w:sz w:val="24"/>
+          <w:szCs w:val="24"/>
+          <w:lang w:val="en-ZA"/>
+        </w:rPr>
+        <w:t>-</w:t>
+      </w:r>
+      <w:r>
+        <w:rPr>
+          <w:rFonts w:hint="default" w:ascii="Times New Roman" w:hAnsi="Times New Roman" w:cs="Times New Roman"/>
+          <w:color w:val="auto"/>
+          <w:sz w:val="24"/>
+          <w:szCs w:val="24"/>
+          <w:lang w:val="en-US"/>
+        </w:rPr>
+        <w:t xml:space="preserve">Email address </w:t>
+      </w:r>
+    </w:p>
+    <w:p>
+      <w:pPr>
+        <w:pStyle w:val="12"/>
+        <w:numPr>
+          <w:ilvl w:val="0"/>
+          <w:numId w:val="0"/>
+        </w:numPr>
+        <w:spacing w:before="240" w:beforeAutospacing="0" w:after="240" w:afterAutospacing="0"/>
+        <w:ind w:left="360" w:leftChars="0" w:firstLine="716" w:firstLineChars="0"/>
+        <w:rPr>
+          <w:rFonts w:hint="default" w:ascii="Times New Roman" w:hAnsi="Times New Roman" w:cs="Times New Roman"/>
+          <w:color w:val="auto"/>
+          <w:sz w:val="24"/>
+          <w:szCs w:val="24"/>
+          <w:lang w:val="en-US"/>
+        </w:rPr>
+      </w:pPr>
+      <w:r>
+        <w:rPr>
+          <w:rFonts w:hint="default" w:ascii="Times New Roman" w:hAnsi="Times New Roman" w:cs="Times New Roman"/>
+          <w:color w:val="auto"/>
+          <w:sz w:val="24"/>
+          <w:szCs w:val="24"/>
+          <w:lang w:val="en-ZA"/>
+        </w:rPr>
+        <w:t>-</w:t>
+      </w:r>
+      <w:r>
+        <w:rPr>
+          <w:rFonts w:hint="default" w:ascii="Times New Roman" w:hAnsi="Times New Roman" w:cs="Times New Roman"/>
+          <w:color w:val="auto"/>
+          <w:sz w:val="24"/>
+          <w:szCs w:val="24"/>
+          <w:lang w:val="en-US"/>
+        </w:rPr>
+        <w:t xml:space="preserve">Social media links </w:t>
+      </w:r>
+    </w:p>
+    <w:p>
+      <w:pPr>
+        <w:pStyle w:val="12"/>
+        <w:numPr>
+          <w:ilvl w:val="0"/>
+          <w:numId w:val="0"/>
+        </w:numPr>
+        <w:spacing w:before="240" w:beforeAutospacing="0" w:after="240" w:afterAutospacing="0"/>
+        <w:ind w:left="360" w:leftChars="0" w:firstLine="716" w:firstLineChars="0"/>
+        <w:rPr>
+          <w:rFonts w:hint="default" w:ascii="Times New Roman" w:hAnsi="Times New Roman" w:cs="Times New Roman"/>
+          <w:color w:val="auto"/>
+          <w:sz w:val="24"/>
+          <w:szCs w:val="24"/>
+          <w:lang w:val="en-US"/>
+        </w:rPr>
+      </w:pPr>
+      <w:r>
+        <w:rPr>
+          <w:rFonts w:hint="default" w:ascii="Times New Roman" w:hAnsi="Times New Roman" w:cs="Times New Roman"/>
+          <w:color w:val="auto"/>
+          <w:sz w:val="24"/>
+          <w:szCs w:val="24"/>
+          <w:lang w:val="en-ZA"/>
+        </w:rPr>
+        <w:t>-</w:t>
+      </w:r>
+      <w:r>
+        <w:rPr>
+          <w:rFonts w:hint="default" w:ascii="Times New Roman" w:hAnsi="Times New Roman" w:cs="Times New Roman"/>
+          <w:color w:val="auto"/>
+          <w:sz w:val="24"/>
+          <w:szCs w:val="24"/>
+          <w:lang w:val="en-US"/>
+        </w:rPr>
+        <w:t xml:space="preserve">Operating hours </w:t>
+      </w:r>
+    </w:p>
+    <w:p>
+      <w:pPr>
+        <w:pStyle w:val="12"/>
+        <w:numPr>
+          <w:ilvl w:val="0"/>
+          <w:numId w:val="0"/>
+        </w:numPr>
+        <w:spacing w:before="240" w:beforeAutospacing="0" w:after="240" w:afterAutospacing="0"/>
+        <w:ind w:left="360" w:leftChars="0" w:firstLine="716" w:firstLineChars="0"/>
+        <w:rPr>
+          <w:rFonts w:hint="default" w:ascii="Times New Roman" w:hAnsi="Times New Roman" w:cs="Times New Roman"/>
+          <w:color w:val="auto"/>
+          <w:sz w:val="24"/>
+          <w:szCs w:val="24"/>
+          <w:lang w:val="en-US"/>
+        </w:rPr>
+      </w:pPr>
+      <w:r>
+        <w:rPr>
+          <w:rFonts w:hint="default" w:ascii="Times New Roman" w:hAnsi="Times New Roman" w:cs="Times New Roman"/>
+          <w:color w:val="auto"/>
+          <w:sz w:val="24"/>
+          <w:szCs w:val="24"/>
+          <w:lang w:val="en-ZA"/>
+        </w:rPr>
+        <w:t>-</w:t>
+      </w:r>
+      <w:r>
+        <w:rPr>
+          <w:rFonts w:hint="default" w:ascii="Times New Roman" w:hAnsi="Times New Roman" w:cs="Times New Roman"/>
+          <w:color w:val="auto"/>
+          <w:sz w:val="24"/>
+          <w:szCs w:val="24"/>
+          <w:lang w:val="en-US"/>
+        </w:rPr>
+        <w:t xml:space="preserve">Physical service areas or locations </w:t>
+      </w:r>
+    </w:p>
+    <w:p>
+      <w:pPr>
+        <w:pStyle w:val="12"/>
+        <w:numPr>
+          <w:ilvl w:val="0"/>
+          <w:numId w:val="0"/>
+        </w:numPr>
+        <w:spacing w:before="240" w:beforeAutospacing="0" w:after="240" w:afterAutospacing="0"/>
+        <w:ind w:left="360" w:leftChars="0"/>
+        <w:rPr>
+          <w:rFonts w:hint="default" w:ascii="Times New Roman" w:hAnsi="Times New Roman" w:cs="Times New Roman"/>
+          <w:color w:val="auto"/>
+          <w:sz w:val="24"/>
+          <w:szCs w:val="24"/>
+          <w:lang w:val="en-US"/>
+        </w:rPr>
+      </w:pPr>
+      <w:r>
+        <w:rPr>
+          <w:rFonts w:hint="default" w:ascii="Times New Roman" w:hAnsi="Times New Roman" w:cs="Times New Roman"/>
+          <w:color w:val="auto"/>
+          <w:sz w:val="24"/>
+          <w:szCs w:val="24"/>
+          <w:lang w:val="en-US"/>
+        </w:rPr>
+        <w:t>To meet assignment requirements, at least two service locations can be included, such as:</w:t>
+      </w:r>
+    </w:p>
+    <w:p>
+      <w:pPr>
+        <w:pStyle w:val="12"/>
+        <w:numPr>
+          <w:ilvl w:val="0"/>
+          <w:numId w:val="0"/>
+        </w:numPr>
+        <w:spacing w:before="240" w:beforeAutospacing="0" w:after="240" w:afterAutospacing="0"/>
+        <w:ind w:left="360" w:leftChars="0" w:firstLine="716" w:firstLineChars="0"/>
+        <w:rPr>
+          <w:rFonts w:hint="default" w:ascii="Times New Roman" w:hAnsi="Times New Roman" w:cs="Times New Roman"/>
+          <w:color w:val="auto"/>
+          <w:sz w:val="24"/>
+          <w:szCs w:val="24"/>
+          <w:lang w:val="en-US"/>
+        </w:rPr>
+      </w:pPr>
+      <w:r>
+        <w:rPr>
+          <w:rFonts w:hint="default" w:ascii="Times New Roman" w:hAnsi="Times New Roman" w:cs="Times New Roman"/>
+          <w:color w:val="auto"/>
+          <w:sz w:val="24"/>
+          <w:szCs w:val="24"/>
+          <w:lang w:val="en-ZA"/>
+        </w:rPr>
+        <w:t>-</w:t>
+      </w:r>
+      <w:r>
+        <w:rPr>
+          <w:rFonts w:hint="default" w:ascii="Times New Roman" w:hAnsi="Times New Roman" w:cs="Times New Roman"/>
+          <w:color w:val="auto"/>
+          <w:sz w:val="24"/>
+          <w:szCs w:val="24"/>
+          <w:lang w:val="en-US"/>
+        </w:rPr>
+        <w:t xml:space="preserve">Cape Town CBD </w:t>
+      </w:r>
+    </w:p>
+    <w:p>
+      <w:pPr>
+        <w:pStyle w:val="12"/>
+        <w:numPr>
+          <w:ilvl w:val="0"/>
+          <w:numId w:val="0"/>
+        </w:numPr>
+        <w:spacing w:before="240" w:beforeAutospacing="0" w:after="240" w:afterAutospacing="0"/>
+        <w:ind w:left="360" w:leftChars="0" w:firstLine="716" w:firstLineChars="0"/>
+        <w:rPr>
+          <w:rFonts w:hint="default" w:ascii="Times New Roman" w:hAnsi="Times New Roman" w:cs="Times New Roman"/>
+          <w:color w:val="auto"/>
+          <w:sz w:val="24"/>
+          <w:szCs w:val="24"/>
+          <w:lang w:val="en-US"/>
+        </w:rPr>
+      </w:pPr>
+      <w:r>
+        <w:rPr>
+          <w:rFonts w:hint="default" w:ascii="Times New Roman" w:hAnsi="Times New Roman" w:cs="Times New Roman"/>
+          <w:color w:val="auto"/>
+          <w:sz w:val="24"/>
+          <w:szCs w:val="24"/>
+          <w:lang w:val="en-ZA"/>
+        </w:rPr>
+        <w:t>-</w:t>
+      </w:r>
+      <w:r>
+        <w:rPr>
+          <w:rFonts w:hint="default" w:ascii="Times New Roman" w:hAnsi="Times New Roman" w:cs="Times New Roman"/>
+          <w:color w:val="auto"/>
+          <w:sz w:val="24"/>
+          <w:szCs w:val="24"/>
+          <w:lang w:val="en-US"/>
+        </w:rPr>
+        <w:t xml:space="preserve">Century City </w:t>
+      </w:r>
+    </w:p>
+    <w:p>
+      <w:pPr>
+        <w:pStyle w:val="12"/>
+        <w:numPr>
+          <w:ilvl w:val="0"/>
+          <w:numId w:val="0"/>
+        </w:numPr>
+        <w:spacing w:before="240" w:beforeAutospacing="0" w:after="240" w:afterAutospacing="0"/>
+        <w:ind w:left="360" w:leftChars="0"/>
+        <w:rPr>
+          <w:rFonts w:hint="default" w:ascii="Times New Roman" w:hAnsi="Times New Roman" w:cs="Times New Roman"/>
+          <w:color w:val="auto"/>
+          <w:sz w:val="24"/>
+          <w:szCs w:val="24"/>
+          <w:lang w:val="en-US"/>
+        </w:rPr>
+      </w:pPr>
+      <w:r>
+        <w:rPr>
+          <w:rFonts w:hint="default" w:ascii="Times New Roman" w:hAnsi="Times New Roman" w:cs="Times New Roman"/>
+          <w:color w:val="auto"/>
+          <w:sz w:val="24"/>
+          <w:szCs w:val="24"/>
+          <w:lang w:val="en-US"/>
+        </w:rPr>
+        <w:t>The page may also include a contact form where users can send messages directly through the website. This feature improves communication and customer support.</w:t>
+      </w:r>
+    </w:p>
+    <w:p>
+      <w:pPr>
+        <w:pStyle w:val="12"/>
+        <w:numPr>
+          <w:ilvl w:val="0"/>
+          <w:numId w:val="0"/>
+        </w:numPr>
+        <w:spacing w:before="240" w:beforeAutospacing="0" w:after="240" w:afterAutospacing="0"/>
+        <w:ind w:left="360" w:leftChars="0"/>
+        <w:rPr>
+          <w:rFonts w:hint="default" w:ascii="Times New Roman" w:hAnsi="Times New Roman" w:cs="Times New Roman"/>
+          <w:color w:val="auto"/>
+          <w:sz w:val="24"/>
+          <w:szCs w:val="24"/>
+          <w:lang w:val="en-US"/>
+        </w:rPr>
+      </w:pPr>
     </w:p>
     <w:p>
       <w:pPr>
@@ -3562,7 +4039,7 @@
           <w:szCs w:val="24"/>
           <w:lang w:val="en-ZA"/>
         </w:rPr>
-        <w:t xml:space="preserve">3.5. </w:t>
+        <w:t xml:space="preserve">3.6. </w:t>
       </w:r>
       <w:r>
         <w:rPr>
@@ -3574,25 +4051,14 @@
           <w:szCs w:val="24"/>
           <w:lang w:val="en-US"/>
         </w:rPr>
-        <w:t xml:space="preserve">Contact </w:t>
-      </w:r>
-      <w:r>
-        <w:rPr>
-          <w:rFonts w:hint="default" w:ascii="Times New Roman" w:hAnsi="Times New Roman" w:cs="Times New Roman"/>
-          <w:b/>
-          <w:bCs/>
-          <w:color w:val="auto"/>
-          <w:sz w:val="24"/>
-          <w:szCs w:val="24"/>
-          <w:lang w:val="en-ZA"/>
-        </w:rPr>
-        <w:t>page</w:t>
+        <w:t>Navigation Menu</w:t>
       </w:r>
     </w:p>
     <w:p>
       <w:pPr>
         <w:pStyle w:val="12"/>
         <w:numPr>
+          <w:ilvl w:val="0"/>
           <w:numId w:val="0"/>
         </w:numPr>
         <w:spacing w:before="240" w:beforeAutospacing="0" w:after="240" w:afterAutospacing="0"/>
@@ -3613,13 +4079,204 @@
           <w:szCs w:val="24"/>
           <w:lang w:val="en-US"/>
         </w:rPr>
-        <w:t>The Contact page provides important communication details for customers who may want to ask questions or request additional information.</w:t>
+        <w:t>The website includes a simple and user-friendly navigation menu displayed at the top of each page. The menu allows users to move easily between:</w:t>
       </w:r>
     </w:p>
     <w:p>
       <w:pPr>
         <w:pStyle w:val="12"/>
         <w:numPr>
+          <w:ilvl w:val="0"/>
+          <w:numId w:val="0"/>
+        </w:numPr>
+        <w:spacing w:before="240" w:beforeAutospacing="0" w:after="240" w:afterAutospacing="0"/>
+        <w:ind w:left="360" w:leftChars="0" w:firstLine="716" w:firstLineChars="0"/>
+        <w:rPr>
+          <w:rFonts w:hint="default" w:ascii="Times New Roman" w:hAnsi="Times New Roman" w:cs="Times New Roman"/>
+          <w:color w:val="auto"/>
+          <w:sz w:val="24"/>
+          <w:szCs w:val="24"/>
+          <w:lang w:val="en-US"/>
+        </w:rPr>
+      </w:pPr>
+      <w:r>
+        <w:rPr>
+          <w:rFonts w:hint="default" w:ascii="Times New Roman" w:hAnsi="Times New Roman" w:cs="Times New Roman"/>
+          <w:color w:val="auto"/>
+          <w:sz w:val="24"/>
+          <w:szCs w:val="24"/>
+          <w:lang w:val="en-ZA"/>
+        </w:rPr>
+        <w:t>-</w:t>
+      </w:r>
+      <w:r>
+        <w:rPr>
+          <w:rFonts w:hint="default" w:ascii="Times New Roman" w:hAnsi="Times New Roman" w:cs="Times New Roman"/>
+          <w:color w:val="auto"/>
+          <w:sz w:val="24"/>
+          <w:szCs w:val="24"/>
+          <w:lang w:val="en-US"/>
+        </w:rPr>
+        <w:t xml:space="preserve">Home </w:t>
+      </w:r>
+    </w:p>
+    <w:p>
+      <w:pPr>
+        <w:pStyle w:val="12"/>
+        <w:numPr>
+          <w:ilvl w:val="0"/>
+          <w:numId w:val="0"/>
+        </w:numPr>
+        <w:spacing w:before="240" w:beforeAutospacing="0" w:after="240" w:afterAutospacing="0"/>
+        <w:ind w:left="360" w:leftChars="0" w:firstLine="716" w:firstLineChars="0"/>
+        <w:rPr>
+          <w:rFonts w:hint="default" w:ascii="Times New Roman" w:hAnsi="Times New Roman" w:cs="Times New Roman"/>
+          <w:color w:val="auto"/>
+          <w:sz w:val="24"/>
+          <w:szCs w:val="24"/>
+          <w:lang w:val="en-US"/>
+        </w:rPr>
+      </w:pPr>
+      <w:r>
+        <w:rPr>
+          <w:rFonts w:hint="default" w:ascii="Times New Roman" w:hAnsi="Times New Roman" w:cs="Times New Roman"/>
+          <w:color w:val="auto"/>
+          <w:sz w:val="24"/>
+          <w:szCs w:val="24"/>
+          <w:lang w:val="en-ZA"/>
+        </w:rPr>
+        <w:t>-</w:t>
+      </w:r>
+      <w:r>
+        <w:rPr>
+          <w:rFonts w:hint="default" w:ascii="Times New Roman" w:hAnsi="Times New Roman" w:cs="Times New Roman"/>
+          <w:color w:val="auto"/>
+          <w:sz w:val="24"/>
+          <w:szCs w:val="24"/>
+          <w:lang w:val="en-US"/>
+        </w:rPr>
+        <w:t xml:space="preserve">Services </w:t>
+      </w:r>
+    </w:p>
+    <w:p>
+      <w:pPr>
+        <w:pStyle w:val="12"/>
+        <w:numPr>
+          <w:ilvl w:val="0"/>
+          <w:numId w:val="0"/>
+        </w:numPr>
+        <w:spacing w:before="240" w:beforeAutospacing="0" w:after="240" w:afterAutospacing="0"/>
+        <w:ind w:left="360" w:leftChars="0" w:firstLine="716" w:firstLineChars="0"/>
+        <w:rPr>
+          <w:rFonts w:hint="default" w:ascii="Times New Roman" w:hAnsi="Times New Roman" w:cs="Times New Roman"/>
+          <w:color w:val="auto"/>
+          <w:sz w:val="24"/>
+          <w:szCs w:val="24"/>
+          <w:lang w:val="en-US"/>
+        </w:rPr>
+      </w:pPr>
+      <w:r>
+        <w:rPr>
+          <w:rFonts w:hint="default" w:ascii="Times New Roman" w:hAnsi="Times New Roman" w:cs="Times New Roman"/>
+          <w:color w:val="auto"/>
+          <w:sz w:val="24"/>
+          <w:szCs w:val="24"/>
+          <w:lang w:val="en-ZA"/>
+        </w:rPr>
+        <w:t>-</w:t>
+      </w:r>
+      <w:r>
+        <w:rPr>
+          <w:rFonts w:hint="default" w:ascii="Times New Roman" w:hAnsi="Times New Roman" w:cs="Times New Roman"/>
+          <w:color w:val="auto"/>
+          <w:sz w:val="24"/>
+          <w:szCs w:val="24"/>
+          <w:lang w:val="en-US"/>
+        </w:rPr>
+        <w:t xml:space="preserve">About </w:t>
+      </w:r>
+    </w:p>
+    <w:p>
+      <w:pPr>
+        <w:pStyle w:val="12"/>
+        <w:numPr>
+          <w:ilvl w:val="0"/>
+          <w:numId w:val="0"/>
+        </w:numPr>
+        <w:spacing w:before="240" w:beforeAutospacing="0" w:after="240" w:afterAutospacing="0"/>
+        <w:ind w:left="360" w:leftChars="0" w:firstLine="716" w:firstLineChars="0"/>
+        <w:rPr>
+          <w:rFonts w:hint="default" w:ascii="Times New Roman" w:hAnsi="Times New Roman" w:cs="Times New Roman"/>
+          <w:color w:val="auto"/>
+          <w:sz w:val="24"/>
+          <w:szCs w:val="24"/>
+          <w:lang w:val="en-US"/>
+        </w:rPr>
+      </w:pPr>
+      <w:r>
+        <w:rPr>
+          <w:rFonts w:hint="default" w:ascii="Times New Roman" w:hAnsi="Times New Roman" w:cs="Times New Roman"/>
+          <w:color w:val="auto"/>
+          <w:sz w:val="24"/>
+          <w:szCs w:val="24"/>
+          <w:lang w:val="en-ZA"/>
+        </w:rPr>
+        <w:t>-</w:t>
+      </w:r>
+      <w:r>
+        <w:rPr>
+          <w:rFonts w:hint="default" w:ascii="Times New Roman" w:hAnsi="Times New Roman" w:cs="Times New Roman"/>
+          <w:color w:val="auto"/>
+          <w:sz w:val="24"/>
+          <w:szCs w:val="24"/>
+          <w:lang w:val="en-US"/>
+        </w:rPr>
+        <w:t xml:space="preserve">Contact </w:t>
+      </w:r>
+    </w:p>
+    <w:p>
+      <w:pPr>
+        <w:pStyle w:val="12"/>
+        <w:numPr>
+          <w:ilvl w:val="0"/>
+          <w:numId w:val="0"/>
+        </w:numPr>
+        <w:spacing w:before="240" w:beforeAutospacing="0" w:after="240" w:afterAutospacing="0"/>
+        <w:ind w:left="360" w:leftChars="0" w:firstLine="716" w:firstLineChars="0"/>
+        <w:rPr>
+          <w:rFonts w:hint="default" w:ascii="Times New Roman" w:hAnsi="Times New Roman" w:cs="Times New Roman"/>
+          <w:color w:val="auto"/>
+          <w:sz w:val="24"/>
+          <w:szCs w:val="24"/>
+          <w:lang w:val="en-US"/>
+        </w:rPr>
+      </w:pPr>
+      <w:r>
+        <w:rPr>
+          <w:rFonts w:hint="default" w:ascii="Times New Roman" w:hAnsi="Times New Roman" w:cs="Times New Roman"/>
+          <w:color w:val="auto"/>
+          <w:sz w:val="24"/>
+          <w:szCs w:val="24"/>
+          <w:lang w:val="en-ZA"/>
+        </w:rPr>
+        <w:t>-</w:t>
+      </w:r>
+      <w:r>
+        <w:rPr>
+          <w:rFonts w:hint="default" w:ascii="Times New Roman" w:hAnsi="Times New Roman" w:cs="Times New Roman"/>
+          <w:color w:val="auto"/>
+          <w:sz w:val="24"/>
+          <w:szCs w:val="24"/>
+          <w:lang w:val="en-US"/>
+        </w:rPr>
+        <w:t xml:space="preserve">Booking </w:t>
+      </w:r>
+    </w:p>
+    <w:p>
+      <w:pPr>
+        <w:pStyle w:val="12"/>
+        <w:numPr>
+          <w:ilvl w:val="0"/>
           <w:numId w:val="0"/>
         </w:numPr>
         <w:spacing w:before="240" w:beforeAutospacing="0" w:after="240" w:afterAutospacing="0"/>
@@ -3640,625 +4297,14 @@
           <w:szCs w:val="24"/>
           <w:lang w:val="en-US"/>
         </w:rPr>
-        <w:t>The page includes:</w:t>
+        <w:t>This improves website usability and helps users quickly find the information they need (Nielsen Norman Group, 2025).</w:t>
       </w:r>
     </w:p>
     <w:p>
       <w:pPr>
         <w:pStyle w:val="12"/>
         <w:numPr>
-          <w:numId w:val="0"/>
-        </w:numPr>
-        <w:spacing w:before="240" w:beforeAutospacing="0" w:after="240" w:afterAutospacing="0"/>
-        <w:ind w:left="360" w:leftChars="0" w:firstLine="716" w:firstLineChars="0"/>
-        <w:rPr>
-          <w:rFonts w:hint="default" w:ascii="Times New Roman" w:hAnsi="Times New Roman" w:cs="Times New Roman"/>
-          <w:color w:val="auto"/>
-          <w:sz w:val="24"/>
-          <w:szCs w:val="24"/>
-          <w:lang w:val="en-US"/>
-        </w:rPr>
-      </w:pPr>
-      <w:r>
-        <w:rPr>
-          <w:rFonts w:hint="default" w:ascii="Times New Roman" w:hAnsi="Times New Roman" w:cs="Times New Roman"/>
-          <w:color w:val="auto"/>
-          <w:sz w:val="24"/>
-          <w:szCs w:val="24"/>
-          <w:lang w:val="en-ZA"/>
-        </w:rPr>
-        <w:t>-</w:t>
-      </w:r>
-      <w:r>
-        <w:rPr>
-          <w:rFonts w:hint="default" w:ascii="Times New Roman" w:hAnsi="Times New Roman" w:cs="Times New Roman"/>
-          <w:color w:val="auto"/>
-          <w:sz w:val="24"/>
-          <w:szCs w:val="24"/>
-          <w:lang w:val="en-US"/>
-        </w:rPr>
-        <w:t xml:space="preserve">Business phone number </w:t>
-      </w:r>
-    </w:p>
-    <w:p>
-      <w:pPr>
-        <w:pStyle w:val="12"/>
-        <w:numPr>
-          <w:numId w:val="0"/>
-        </w:numPr>
-        <w:spacing w:before="240" w:beforeAutospacing="0" w:after="240" w:afterAutospacing="0"/>
-        <w:ind w:left="360" w:leftChars="0" w:firstLine="716" w:firstLineChars="0"/>
-        <w:rPr>
-          <w:rFonts w:hint="default" w:ascii="Times New Roman" w:hAnsi="Times New Roman" w:cs="Times New Roman"/>
-          <w:color w:val="auto"/>
-          <w:sz w:val="24"/>
-          <w:szCs w:val="24"/>
-          <w:lang w:val="en-US"/>
-        </w:rPr>
-      </w:pPr>
-      <w:r>
-        <w:rPr>
-          <w:rFonts w:hint="default" w:ascii="Times New Roman" w:hAnsi="Times New Roman" w:cs="Times New Roman"/>
-          <w:color w:val="auto"/>
-          <w:sz w:val="24"/>
-          <w:szCs w:val="24"/>
-          <w:lang w:val="en-ZA"/>
-        </w:rPr>
-        <w:t>-</w:t>
-      </w:r>
-      <w:r>
-        <w:rPr>
-          <w:rFonts w:hint="default" w:ascii="Times New Roman" w:hAnsi="Times New Roman" w:cs="Times New Roman"/>
-          <w:color w:val="auto"/>
-          <w:sz w:val="24"/>
-          <w:szCs w:val="24"/>
-          <w:lang w:val="en-US"/>
-        </w:rPr>
-        <w:t xml:space="preserve">Email address </w:t>
-      </w:r>
-    </w:p>
-    <w:p>
-      <w:pPr>
-        <w:pStyle w:val="12"/>
-        <w:numPr>
-          <w:numId w:val="0"/>
-        </w:numPr>
-        <w:spacing w:before="240" w:beforeAutospacing="0" w:after="240" w:afterAutospacing="0"/>
-        <w:ind w:left="360" w:leftChars="0" w:firstLine="716" w:firstLineChars="0"/>
-        <w:rPr>
-          <w:rFonts w:hint="default" w:ascii="Times New Roman" w:hAnsi="Times New Roman" w:cs="Times New Roman"/>
-          <w:color w:val="auto"/>
-          <w:sz w:val="24"/>
-          <w:szCs w:val="24"/>
-          <w:lang w:val="en-US"/>
-        </w:rPr>
-      </w:pPr>
-      <w:r>
-        <w:rPr>
-          <w:rFonts w:hint="default" w:ascii="Times New Roman" w:hAnsi="Times New Roman" w:cs="Times New Roman"/>
-          <w:color w:val="auto"/>
-          <w:sz w:val="24"/>
-          <w:szCs w:val="24"/>
-          <w:lang w:val="en-ZA"/>
-        </w:rPr>
-        <w:t>-</w:t>
-      </w:r>
-      <w:r>
-        <w:rPr>
-          <w:rFonts w:hint="default" w:ascii="Times New Roman" w:hAnsi="Times New Roman" w:cs="Times New Roman"/>
-          <w:color w:val="auto"/>
-          <w:sz w:val="24"/>
-          <w:szCs w:val="24"/>
-          <w:lang w:val="en-US"/>
-        </w:rPr>
-        <w:t xml:space="preserve">Social media links </w:t>
-      </w:r>
-    </w:p>
-    <w:p>
-      <w:pPr>
-        <w:pStyle w:val="12"/>
-        <w:numPr>
-          <w:numId w:val="0"/>
-        </w:numPr>
-        <w:spacing w:before="240" w:beforeAutospacing="0" w:after="240" w:afterAutospacing="0"/>
-        <w:ind w:left="360" w:leftChars="0" w:firstLine="716" w:firstLineChars="0"/>
-        <w:rPr>
-          <w:rFonts w:hint="default" w:ascii="Times New Roman" w:hAnsi="Times New Roman" w:cs="Times New Roman"/>
-          <w:color w:val="auto"/>
-          <w:sz w:val="24"/>
-          <w:szCs w:val="24"/>
-          <w:lang w:val="en-US"/>
-        </w:rPr>
-      </w:pPr>
-      <w:r>
-        <w:rPr>
-          <w:rFonts w:hint="default" w:ascii="Times New Roman" w:hAnsi="Times New Roman" w:cs="Times New Roman"/>
-          <w:color w:val="auto"/>
-          <w:sz w:val="24"/>
-          <w:szCs w:val="24"/>
-          <w:lang w:val="en-ZA"/>
-        </w:rPr>
-        <w:t>-</w:t>
-      </w:r>
-      <w:r>
-        <w:rPr>
-          <w:rFonts w:hint="default" w:ascii="Times New Roman" w:hAnsi="Times New Roman" w:cs="Times New Roman"/>
-          <w:color w:val="auto"/>
-          <w:sz w:val="24"/>
-          <w:szCs w:val="24"/>
-          <w:lang w:val="en-US"/>
-        </w:rPr>
-        <w:t xml:space="preserve">Operating hours </w:t>
-      </w:r>
-    </w:p>
-    <w:p>
-      <w:pPr>
-        <w:pStyle w:val="12"/>
-        <w:numPr>
-          <w:numId w:val="0"/>
-        </w:numPr>
-        <w:spacing w:before="240" w:beforeAutospacing="0" w:after="240" w:afterAutospacing="0"/>
-        <w:ind w:left="360" w:leftChars="0" w:firstLine="716" w:firstLineChars="0"/>
-        <w:rPr>
-          <w:rFonts w:hint="default" w:ascii="Times New Roman" w:hAnsi="Times New Roman" w:cs="Times New Roman"/>
-          <w:color w:val="auto"/>
-          <w:sz w:val="24"/>
-          <w:szCs w:val="24"/>
-          <w:lang w:val="en-US"/>
-        </w:rPr>
-      </w:pPr>
-      <w:r>
-        <w:rPr>
-          <w:rFonts w:hint="default" w:ascii="Times New Roman" w:hAnsi="Times New Roman" w:cs="Times New Roman"/>
-          <w:color w:val="auto"/>
-          <w:sz w:val="24"/>
-          <w:szCs w:val="24"/>
-          <w:lang w:val="en-ZA"/>
-        </w:rPr>
-        <w:t>-</w:t>
-      </w:r>
-      <w:r>
-        <w:rPr>
-          <w:rFonts w:hint="default" w:ascii="Times New Roman" w:hAnsi="Times New Roman" w:cs="Times New Roman"/>
-          <w:color w:val="auto"/>
-          <w:sz w:val="24"/>
-          <w:szCs w:val="24"/>
-          <w:lang w:val="en-US"/>
-        </w:rPr>
-        <w:t xml:space="preserve">Physical service areas or locations </w:t>
-      </w:r>
-    </w:p>
-    <w:p>
-      <w:pPr>
-        <w:pStyle w:val="12"/>
-        <w:numPr>
-          <w:numId w:val="0"/>
-        </w:numPr>
-        <w:spacing w:before="240" w:beforeAutospacing="0" w:after="240" w:afterAutospacing="0"/>
-        <w:ind w:left="360" w:leftChars="0"/>
-        <w:rPr>
-          <w:rFonts w:hint="default" w:ascii="Times New Roman" w:hAnsi="Times New Roman" w:cs="Times New Roman"/>
-          <w:color w:val="auto"/>
-          <w:sz w:val="24"/>
-          <w:szCs w:val="24"/>
-          <w:lang w:val="en-US"/>
-        </w:rPr>
-      </w:pPr>
-      <w:r>
-        <w:rPr>
-          <w:rFonts w:hint="default" w:ascii="Times New Roman" w:hAnsi="Times New Roman" w:cs="Times New Roman"/>
-          <w:color w:val="auto"/>
-          <w:sz w:val="24"/>
-          <w:szCs w:val="24"/>
-          <w:lang w:val="en-US"/>
-        </w:rPr>
-        <w:t>To meet assignment requirements, at least two service locations can be included, such as:</w:t>
-      </w:r>
-    </w:p>
-    <w:p>
-      <w:pPr>
-        <w:pStyle w:val="12"/>
-        <w:numPr>
-          <w:numId w:val="0"/>
-        </w:numPr>
-        <w:spacing w:before="240" w:beforeAutospacing="0" w:after="240" w:afterAutospacing="0"/>
-        <w:ind w:left="360" w:leftChars="0" w:firstLine="716" w:firstLineChars="0"/>
-        <w:rPr>
-          <w:rFonts w:hint="default" w:ascii="Times New Roman" w:hAnsi="Times New Roman" w:cs="Times New Roman"/>
-          <w:color w:val="auto"/>
-          <w:sz w:val="24"/>
-          <w:szCs w:val="24"/>
-          <w:lang w:val="en-US"/>
-        </w:rPr>
-      </w:pPr>
-      <w:r>
-        <w:rPr>
-          <w:rFonts w:hint="default" w:ascii="Times New Roman" w:hAnsi="Times New Roman" w:cs="Times New Roman"/>
-          <w:color w:val="auto"/>
-          <w:sz w:val="24"/>
-          <w:szCs w:val="24"/>
-          <w:lang w:val="en-ZA"/>
-        </w:rPr>
-        <w:t>-</w:t>
-      </w:r>
-      <w:r>
-        <w:rPr>
-          <w:rFonts w:hint="default" w:ascii="Times New Roman" w:hAnsi="Times New Roman" w:cs="Times New Roman"/>
-          <w:color w:val="auto"/>
-          <w:sz w:val="24"/>
-          <w:szCs w:val="24"/>
-          <w:lang w:val="en-US"/>
-        </w:rPr>
-        <w:t xml:space="preserve">Cape Town CBD </w:t>
-      </w:r>
-    </w:p>
-    <w:p>
-      <w:pPr>
-        <w:pStyle w:val="12"/>
-        <w:numPr>
-          <w:numId w:val="0"/>
-        </w:numPr>
-        <w:spacing w:before="240" w:beforeAutospacing="0" w:after="240" w:afterAutospacing="0"/>
-        <w:ind w:left="360" w:leftChars="0" w:firstLine="716" w:firstLineChars="0"/>
-        <w:rPr>
-          <w:rFonts w:hint="default" w:ascii="Times New Roman" w:hAnsi="Times New Roman" w:cs="Times New Roman"/>
-          <w:color w:val="auto"/>
-          <w:sz w:val="24"/>
-          <w:szCs w:val="24"/>
-          <w:lang w:val="en-US"/>
-        </w:rPr>
-      </w:pPr>
-      <w:r>
-        <w:rPr>
-          <w:rFonts w:hint="default" w:ascii="Times New Roman" w:hAnsi="Times New Roman" w:cs="Times New Roman"/>
-          <w:color w:val="auto"/>
-          <w:sz w:val="24"/>
-          <w:szCs w:val="24"/>
-          <w:lang w:val="en-ZA"/>
-        </w:rPr>
-        <w:t>-</w:t>
-      </w:r>
-      <w:r>
-        <w:rPr>
-          <w:rFonts w:hint="default" w:ascii="Times New Roman" w:hAnsi="Times New Roman" w:cs="Times New Roman"/>
-          <w:color w:val="auto"/>
-          <w:sz w:val="24"/>
-          <w:szCs w:val="24"/>
-          <w:lang w:val="en-US"/>
-        </w:rPr>
-        <w:t xml:space="preserve">Century City </w:t>
-      </w:r>
-    </w:p>
-    <w:p>
-      <w:pPr>
-        <w:pStyle w:val="12"/>
-        <w:numPr>
-          <w:numId w:val="0"/>
-        </w:numPr>
-        <w:spacing w:before="240" w:beforeAutospacing="0" w:after="240" w:afterAutospacing="0"/>
-        <w:ind w:left="360" w:leftChars="0"/>
-        <w:rPr>
-          <w:rFonts w:hint="default" w:ascii="Times New Roman" w:hAnsi="Times New Roman" w:cs="Times New Roman"/>
-          <w:color w:val="auto"/>
-          <w:sz w:val="24"/>
-          <w:szCs w:val="24"/>
-          <w:lang w:val="en-US"/>
-        </w:rPr>
-      </w:pPr>
-      <w:r>
-        <w:rPr>
-          <w:rFonts w:hint="default" w:ascii="Times New Roman" w:hAnsi="Times New Roman" w:cs="Times New Roman"/>
-          <w:color w:val="auto"/>
-          <w:sz w:val="24"/>
-          <w:szCs w:val="24"/>
-          <w:lang w:val="en-US"/>
-        </w:rPr>
-        <w:t>The page may also include a contact form where users can send messages directly through the website. This feature improves communication and customer support.</w:t>
-      </w:r>
-    </w:p>
-    <w:p>
-      <w:pPr>
-        <w:pStyle w:val="12"/>
-        <w:numPr>
-          <w:numId w:val="0"/>
-        </w:numPr>
-        <w:spacing w:before="240" w:beforeAutospacing="0" w:after="240" w:afterAutospacing="0"/>
-        <w:ind w:left="360" w:leftChars="0"/>
-        <w:rPr>
-          <w:rFonts w:hint="default" w:ascii="Times New Roman" w:hAnsi="Times New Roman" w:cs="Times New Roman"/>
-          <w:color w:val="auto"/>
-          <w:sz w:val="24"/>
-          <w:szCs w:val="24"/>
-          <w:lang w:val="en-US"/>
-        </w:rPr>
-      </w:pPr>
-    </w:p>
-    <w:p>
-      <w:pPr>
-        <w:pStyle w:val="12"/>
-        <w:numPr>
-          <w:ilvl w:val="0"/>
-          <w:numId w:val="6"/>
-        </w:numPr>
-        <w:spacing w:before="240" w:beforeAutospacing="0" w:after="240" w:afterAutospacing="0"/>
-        <w:rPr>
-          <w:rFonts w:hint="default" w:ascii="Times New Roman" w:hAnsi="Times New Roman" w:cs="Times New Roman"/>
-          <w:b/>
-          <w:bCs/>
-          <w:color w:val="auto"/>
-          <w:sz w:val="24"/>
-          <w:szCs w:val="24"/>
-          <w:lang w:val="en-US"/>
-        </w:rPr>
-      </w:pPr>
-      <w:r>
-        <w:rPr>
-          <w:rFonts w:hint="default" w:ascii="Times New Roman" w:hAnsi="Times New Roman" w:cs="Times New Roman"/>
-          <w:b/>
-          <w:bCs/>
-          <w:color w:val="auto"/>
-          <w:sz w:val="24"/>
-          <w:szCs w:val="24"/>
-          <w:lang w:val="en-ZA"/>
-        </w:rPr>
-        <w:t xml:space="preserve">3.6. </w:t>
-      </w:r>
-      <w:r>
-        <w:rPr>
-          <w:rFonts w:hint="default" w:ascii="Times New Roman" w:hAnsi="Times New Roman" w:cs="Times New Roman"/>
-          <w:b/>
-          <w:bCs/>
-          <w:color w:val="auto"/>
-          <w:sz w:val="24"/>
-          <w:szCs w:val="24"/>
-          <w:lang w:val="en-US"/>
-        </w:rPr>
-        <w:t>Navigation Menu</w:t>
-      </w:r>
-    </w:p>
-    <w:p>
-      <w:pPr>
-        <w:pStyle w:val="12"/>
-        <w:numPr>
-          <w:numId w:val="0"/>
-        </w:numPr>
-        <w:spacing w:before="240" w:beforeAutospacing="0" w:after="240" w:afterAutospacing="0"/>
-        <w:ind w:left="360" w:leftChars="0"/>
-        <w:rPr>
-          <w:rFonts w:hint="default" w:ascii="Times New Roman" w:hAnsi="Times New Roman" w:cs="Times New Roman"/>
-          <w:color w:val="auto"/>
-          <w:sz w:val="24"/>
-          <w:szCs w:val="24"/>
-          <w:lang w:val="en-US"/>
-        </w:rPr>
-      </w:pPr>
-      <w:r>
-        <w:rPr>
-          <w:rFonts w:hint="default" w:ascii="Times New Roman" w:hAnsi="Times New Roman" w:cs="Times New Roman"/>
-          <w:color w:val="auto"/>
-          <w:sz w:val="24"/>
-          <w:szCs w:val="24"/>
-          <w:lang w:val="en-US"/>
-        </w:rPr>
-        <w:t>The website includes a simple and user-friendly navigation menu displayed at the top of each page. The menu allows users to move easily between:</w:t>
-      </w:r>
-    </w:p>
-    <w:p>
-      <w:pPr>
-        <w:pStyle w:val="12"/>
-        <w:numPr>
-          <w:numId w:val="0"/>
-        </w:numPr>
-        <w:spacing w:before="240" w:beforeAutospacing="0" w:after="240" w:afterAutospacing="0"/>
-        <w:ind w:left="360" w:leftChars="0" w:firstLine="716" w:firstLineChars="0"/>
-        <w:rPr>
-          <w:rFonts w:hint="default" w:ascii="Times New Roman" w:hAnsi="Times New Roman" w:cs="Times New Roman"/>
-          <w:color w:val="auto"/>
-          <w:sz w:val="24"/>
-          <w:szCs w:val="24"/>
-          <w:lang w:val="en-US"/>
-        </w:rPr>
-      </w:pPr>
-      <w:r>
-        <w:rPr>
-          <w:rFonts w:hint="default" w:ascii="Times New Roman" w:hAnsi="Times New Roman" w:cs="Times New Roman"/>
-          <w:color w:val="auto"/>
-          <w:sz w:val="24"/>
-          <w:szCs w:val="24"/>
-          <w:lang w:val="en-ZA"/>
-        </w:rPr>
-        <w:t>-</w:t>
-      </w:r>
-      <w:r>
-        <w:rPr>
-          <w:rFonts w:hint="default" w:ascii="Times New Roman" w:hAnsi="Times New Roman" w:cs="Times New Roman"/>
-          <w:color w:val="auto"/>
-          <w:sz w:val="24"/>
-          <w:szCs w:val="24"/>
-          <w:lang w:val="en-US"/>
-        </w:rPr>
-        <w:t xml:space="preserve">Home </w:t>
-      </w:r>
-    </w:p>
-    <w:p>
-      <w:pPr>
-        <w:pStyle w:val="12"/>
-        <w:numPr>
-          <w:numId w:val="0"/>
-        </w:numPr>
-        <w:spacing w:before="240" w:beforeAutospacing="0" w:after="240" w:afterAutospacing="0"/>
-        <w:ind w:left="360" w:leftChars="0" w:firstLine="716" w:firstLineChars="0"/>
-        <w:rPr>
-          <w:rFonts w:hint="default" w:ascii="Times New Roman" w:hAnsi="Times New Roman" w:cs="Times New Roman"/>
-          <w:color w:val="auto"/>
-          <w:sz w:val="24"/>
-          <w:szCs w:val="24"/>
-          <w:lang w:val="en-US"/>
-        </w:rPr>
-      </w:pPr>
-      <w:r>
-        <w:rPr>
-          <w:rFonts w:hint="default" w:ascii="Times New Roman" w:hAnsi="Times New Roman" w:cs="Times New Roman"/>
-          <w:color w:val="auto"/>
-          <w:sz w:val="24"/>
-          <w:szCs w:val="24"/>
-          <w:lang w:val="en-ZA"/>
-        </w:rPr>
-        <w:t>-</w:t>
-      </w:r>
-      <w:r>
-        <w:rPr>
-          <w:rFonts w:hint="default" w:ascii="Times New Roman" w:hAnsi="Times New Roman" w:cs="Times New Roman"/>
-          <w:color w:val="auto"/>
-          <w:sz w:val="24"/>
-          <w:szCs w:val="24"/>
-          <w:lang w:val="en-US"/>
-        </w:rPr>
-        <w:t xml:space="preserve">Services </w:t>
-      </w:r>
-    </w:p>
-    <w:p>
-      <w:pPr>
-        <w:pStyle w:val="12"/>
-        <w:numPr>
-          <w:numId w:val="0"/>
-        </w:numPr>
-        <w:spacing w:before="240" w:beforeAutospacing="0" w:after="240" w:afterAutospacing="0"/>
-        <w:ind w:left="360" w:leftChars="0" w:firstLine="716" w:firstLineChars="0"/>
-        <w:rPr>
-          <w:rFonts w:hint="default" w:ascii="Times New Roman" w:hAnsi="Times New Roman" w:cs="Times New Roman"/>
-          <w:color w:val="auto"/>
-          <w:sz w:val="24"/>
-          <w:szCs w:val="24"/>
-          <w:lang w:val="en-US"/>
-        </w:rPr>
-      </w:pPr>
-      <w:r>
-        <w:rPr>
-          <w:rFonts w:hint="default" w:ascii="Times New Roman" w:hAnsi="Times New Roman" w:cs="Times New Roman"/>
-          <w:color w:val="auto"/>
-          <w:sz w:val="24"/>
-          <w:szCs w:val="24"/>
-          <w:lang w:val="en-ZA"/>
-        </w:rPr>
-        <w:t>-</w:t>
-      </w:r>
-      <w:r>
-        <w:rPr>
-          <w:rFonts w:hint="default" w:ascii="Times New Roman" w:hAnsi="Times New Roman" w:cs="Times New Roman"/>
-          <w:color w:val="auto"/>
-          <w:sz w:val="24"/>
-          <w:szCs w:val="24"/>
-          <w:lang w:val="en-US"/>
-        </w:rPr>
-        <w:t xml:space="preserve">About </w:t>
-      </w:r>
-    </w:p>
-    <w:p>
-      <w:pPr>
-        <w:pStyle w:val="12"/>
-        <w:numPr>
-          <w:numId w:val="0"/>
-        </w:numPr>
-        <w:spacing w:before="240" w:beforeAutospacing="0" w:after="240" w:afterAutospacing="0"/>
-        <w:ind w:left="360" w:leftChars="0" w:firstLine="716" w:firstLineChars="0"/>
-        <w:rPr>
-          <w:rFonts w:hint="default" w:ascii="Times New Roman" w:hAnsi="Times New Roman" w:cs="Times New Roman"/>
-          <w:color w:val="auto"/>
-          <w:sz w:val="24"/>
-          <w:szCs w:val="24"/>
-          <w:lang w:val="en-US"/>
-        </w:rPr>
-      </w:pPr>
-      <w:r>
-        <w:rPr>
-          <w:rFonts w:hint="default" w:ascii="Times New Roman" w:hAnsi="Times New Roman" w:cs="Times New Roman"/>
-          <w:color w:val="auto"/>
-          <w:sz w:val="24"/>
-          <w:szCs w:val="24"/>
-          <w:lang w:val="en-ZA"/>
-        </w:rPr>
-        <w:t>-</w:t>
-      </w:r>
-      <w:r>
-        <w:rPr>
-          <w:rFonts w:hint="default" w:ascii="Times New Roman" w:hAnsi="Times New Roman" w:cs="Times New Roman"/>
-          <w:color w:val="auto"/>
-          <w:sz w:val="24"/>
-          <w:szCs w:val="24"/>
-          <w:lang w:val="en-US"/>
-        </w:rPr>
-        <w:t xml:space="preserve">Contact </w:t>
-      </w:r>
-    </w:p>
-    <w:p>
-      <w:pPr>
-        <w:pStyle w:val="12"/>
-        <w:numPr>
-          <w:numId w:val="0"/>
-        </w:numPr>
-        <w:spacing w:before="240" w:beforeAutospacing="0" w:after="240" w:afterAutospacing="0"/>
-        <w:ind w:left="360" w:leftChars="0" w:firstLine="716" w:firstLineChars="0"/>
-        <w:rPr>
-          <w:rFonts w:hint="default" w:ascii="Times New Roman" w:hAnsi="Times New Roman" w:cs="Times New Roman"/>
-          <w:color w:val="auto"/>
-          <w:sz w:val="24"/>
-          <w:szCs w:val="24"/>
-          <w:lang w:val="en-US"/>
-        </w:rPr>
-      </w:pPr>
-      <w:r>
-        <w:rPr>
-          <w:rFonts w:hint="default" w:ascii="Times New Roman" w:hAnsi="Times New Roman" w:cs="Times New Roman"/>
-          <w:color w:val="auto"/>
-          <w:sz w:val="24"/>
-          <w:szCs w:val="24"/>
-          <w:lang w:val="en-ZA"/>
-        </w:rPr>
-        <w:t>-</w:t>
-      </w:r>
-      <w:r>
-        <w:rPr>
-          <w:rFonts w:hint="default" w:ascii="Times New Roman" w:hAnsi="Times New Roman" w:cs="Times New Roman"/>
-          <w:color w:val="auto"/>
-          <w:sz w:val="24"/>
-          <w:szCs w:val="24"/>
-          <w:lang w:val="en-US"/>
-        </w:rPr>
-        <w:t xml:space="preserve">Booking </w:t>
-      </w:r>
-    </w:p>
-    <w:p>
-      <w:pPr>
-        <w:pStyle w:val="12"/>
-        <w:numPr>
-          <w:numId w:val="0"/>
-        </w:numPr>
-        <w:spacing w:before="240" w:beforeAutospacing="0" w:after="240" w:afterAutospacing="0"/>
-        <w:ind w:left="360" w:leftChars="0"/>
-        <w:rPr>
-          <w:rFonts w:hint="default" w:ascii="Times New Roman" w:hAnsi="Times New Roman" w:cs="Times New Roman"/>
-          <w:color w:val="auto"/>
-          <w:sz w:val="24"/>
-          <w:szCs w:val="24"/>
-          <w:lang w:val="en-US"/>
-        </w:rPr>
-      </w:pPr>
-      <w:r>
-        <w:rPr>
-          <w:rFonts w:hint="default" w:ascii="Times New Roman" w:hAnsi="Times New Roman" w:cs="Times New Roman"/>
-          <w:color w:val="auto"/>
-          <w:sz w:val="24"/>
-          <w:szCs w:val="24"/>
-          <w:lang w:val="en-US"/>
-        </w:rPr>
-        <w:t>This improves website usability and helps users quickly find the information they need.</w:t>
-      </w:r>
-    </w:p>
-    <w:p>
-      <w:pPr>
-        <w:pStyle w:val="12"/>
-        <w:numPr>
+          <w:ilvl w:val="0"/>
           <w:numId w:val="0"/>
         </w:numPr>
         <w:spacing w:before="240" w:beforeAutospacing="0" w:after="240" w:afterAutospacing="0"/>
@@ -4384,7 +4430,24 @@
           <w:sz w:val="24"/>
           <w:szCs w:val="24"/>
         </w:rPr>
-        <w:t>The proposed colour palette is inspired by cleanliness, water, professionalism, and modern technology. The colours create a fresh and trustworthy appearance that matches the mobile car wash industry.</w:t>
+        <w:t xml:space="preserve">The proposed colour palette is inspired by cleanliness, water, professionalism, and modern technology (Adobe, 2025). The </w:t>
+      </w:r>
+      <w:r>
+        <w:rPr>
+          <w:rFonts w:hint="default" w:cs="Times New Roman"/>
+          <w:sz w:val="24"/>
+          <w:szCs w:val="24"/>
+          <w:lang w:val="en-ZA"/>
+        </w:rPr>
+        <w:t>colors</w:t>
+      </w:r>
+      <w:r>
+        <w:rPr>
+          <w:rFonts w:hint="default" w:ascii="Times New Roman" w:hAnsi="Times New Roman" w:cs="Times New Roman"/>
+          <w:sz w:val="24"/>
+          <w:szCs w:val="24"/>
+        </w:rPr>
+        <w:t xml:space="preserve"> create a fresh and trustworthy appearance that matches the mobile car wash industry.</w:t>
       </w:r>
     </w:p>
     <w:p>
@@ -4411,6 +4474,7 @@
     </w:p>
     <w:tbl>
       <w:tblPr>
+        <w:tblStyle w:val="5"/>
         <w:tblW w:w="0" w:type="auto"/>
         <w:tblCellSpacing w:w="15" w:type="dxa"/>
         <w:tblInd w:w="0" w:type="dxa"/>
@@ -4422,7 +4486,7 @@
           <w:insideH w:val="none" w:color="auto" w:sz="0" w:space="0"/>
           <w:insideV w:val="none" w:color="auto" w:sz="0" w:space="0"/>
         </w:tblBorders>
-        <w:shd w:val="clear"/>
+        <w:shd w:val="clear" w:color="auto" w:fill="auto"/>
         <w:tblLayout w:type="autofit"/>
         <w:tblCellMar>
           <w:top w:w="15" w:type="dxa"/>
@@ -4446,7 +4510,6 @@
             <w:insideH w:val="none" w:color="auto" w:sz="0" w:space="0"/>
             <w:insideV w:val="none" w:color="auto" w:sz="0" w:space="0"/>
           </w:tblBorders>
-          <w:shd w:val="clear"/>
           <w:tblCellMar>
             <w:top w:w="15" w:type="dxa"/>
             <w:left w:w="15" w:type="dxa"/>
@@ -4461,7 +4524,7 @@
         <w:tc>
           <w:tcPr>
             <w:tcW w:w="0" w:type="auto"/>
-            <w:shd w:val="clear"/>
+            <w:shd w:val="clear" w:color="auto" w:fill="auto"/>
             <w:vAlign w:val="center"/>
           </w:tcPr>
           <w:p>
@@ -4496,7 +4559,7 @@
         <w:tc>
           <w:tcPr>
             <w:tcW w:w="0" w:type="auto"/>
-            <w:shd w:val="clear"/>
+            <w:shd w:val="clear" w:color="auto" w:fill="auto"/>
             <w:vAlign w:val="center"/>
           </w:tcPr>
           <w:p>
@@ -4531,7 +4594,7 @@
         <w:tc>
           <w:tcPr>
             <w:tcW w:w="0" w:type="auto"/>
-            <w:shd w:val="clear"/>
+            <w:shd w:val="clear" w:color="auto" w:fill="auto"/>
             <w:vAlign w:val="center"/>
           </w:tcPr>
           <w:p>
@@ -4574,7 +4637,7 @@
             <w:insideH w:val="none" w:color="auto" w:sz="0" w:space="0"/>
             <w:insideV w:val="none" w:color="auto" w:sz="0" w:space="0"/>
           </w:tblBorders>
-          <w:shd w:val="clear"/>
+          <w:shd w:val="clear" w:color="auto" w:fill="auto"/>
           <w:tblCellMar>
             <w:top w:w="15" w:type="dxa"/>
             <w:left w:w="15" w:type="dxa"/>
@@ -4588,7 +4651,7 @@
         <w:tc>
           <w:tcPr>
             <w:tcW w:w="0" w:type="auto"/>
-            <w:shd w:val="clear"/>
+            <w:shd w:val="clear" w:color="auto" w:fill="auto"/>
             <w:vAlign w:val="center"/>
           </w:tcPr>
           <w:p>
@@ -4619,7 +4682,7 @@
         <w:tc>
           <w:tcPr>
             <w:tcW w:w="0" w:type="auto"/>
-            <w:shd w:val="clear"/>
+            <w:shd w:val="clear" w:color="auto" w:fill="auto"/>
             <w:vAlign w:val="center"/>
           </w:tcPr>
           <w:p>
@@ -4650,7 +4713,7 @@
         <w:tc>
           <w:tcPr>
             <w:tcW w:w="0" w:type="auto"/>
-            <w:shd w:val="clear"/>
+            <w:shd w:val="clear" w:color="auto" w:fill="auto"/>
             <w:vAlign w:val="center"/>
           </w:tcPr>
           <w:p>
@@ -4689,6 +4752,7 @@
             <w:insideH w:val="none" w:color="auto" w:sz="0" w:space="0"/>
             <w:insideV w:val="none" w:color="auto" w:sz="0" w:space="0"/>
           </w:tblBorders>
+          <w:shd w:val="clear" w:color="auto" w:fill="auto"/>
           <w:tblCellMar>
             <w:top w:w="15" w:type="dxa"/>
             <w:left w:w="15" w:type="dxa"/>
@@ -4702,7 +4766,7 @@
         <w:tc>
           <w:tcPr>
             <w:tcW w:w="0" w:type="auto"/>
-            <w:shd w:val="clear"/>
+            <w:shd w:val="clear" w:color="auto" w:fill="auto"/>
             <w:vAlign w:val="center"/>
           </w:tcPr>
           <w:p>
@@ -4733,7 +4797,7 @@
         <w:tc>
           <w:tcPr>
             <w:tcW w:w="0" w:type="auto"/>
-            <w:shd w:val="clear"/>
+            <w:shd w:val="clear" w:color="auto" w:fill="auto"/>
             <w:vAlign w:val="center"/>
           </w:tcPr>
           <w:p>
@@ -4764,7 +4828,7 @@
         <w:tc>
           <w:tcPr>
             <w:tcW w:w="0" w:type="auto"/>
-            <w:shd w:val="clear"/>
+            <w:shd w:val="clear" w:color="auto" w:fill="auto"/>
             <w:vAlign w:val="center"/>
           </w:tcPr>
           <w:p>
@@ -4803,7 +4867,7 @@
             <w:insideH w:val="none" w:color="auto" w:sz="0" w:space="0"/>
             <w:insideV w:val="none" w:color="auto" w:sz="0" w:space="0"/>
           </w:tblBorders>
-          <w:shd w:val="clear"/>
+          <w:shd w:val="clear" w:color="auto" w:fill="auto"/>
           <w:tblCellMar>
             <w:top w:w="15" w:type="dxa"/>
             <w:left w:w="15" w:type="dxa"/>
@@ -4817,7 +4881,7 @@
         <w:tc>
           <w:tcPr>
             <w:tcW w:w="0" w:type="auto"/>
-            <w:shd w:val="clear"/>
+            <w:shd w:val="clear" w:color="auto" w:fill="auto"/>
             <w:vAlign w:val="center"/>
           </w:tcPr>
           <w:p>
@@ -4848,7 +4912,7 @@
         <w:tc>
           <w:tcPr>
             <w:tcW w:w="0" w:type="auto"/>
-            <w:shd w:val="clear"/>
+            <w:shd w:val="clear" w:color="auto" w:fill="auto"/>
             <w:vAlign w:val="center"/>
           </w:tcPr>
           <w:p>
@@ -4879,7 +4943,7 @@
         <w:tc>
           <w:tcPr>
             <w:tcW w:w="0" w:type="auto"/>
-            <w:shd w:val="clear"/>
+            <w:shd w:val="clear" w:color="auto" w:fill="auto"/>
             <w:vAlign w:val="center"/>
           </w:tcPr>
           <w:p>
@@ -4933,6 +4997,7 @@
     </w:p>
     <w:tbl>
       <w:tblPr>
+        <w:tblStyle w:val="5"/>
         <w:tblW w:w="0" w:type="auto"/>
         <w:tblCellSpacing w:w="15" w:type="dxa"/>
         <w:tblInd w:w="0" w:type="dxa"/>
@@ -4944,7 +5009,7 @@
           <w:insideH w:val="none" w:color="auto" w:sz="0" w:space="0"/>
           <w:insideV w:val="none" w:color="auto" w:sz="0" w:space="0"/>
         </w:tblBorders>
-        <w:shd w:val="clear"/>
+        <w:shd w:val="clear" w:color="auto" w:fill="auto"/>
         <w:tblLayout w:type="autofit"/>
         <w:tblCellMar>
           <w:top w:w="15" w:type="dxa"/>
@@ -4968,7 +5033,6 @@
             <w:insideH w:val="none" w:color="auto" w:sz="0" w:space="0"/>
             <w:insideV w:val="none" w:color="auto" w:sz="0" w:space="0"/>
           </w:tblBorders>
-          <w:shd w:val="clear"/>
           <w:tblCellMar>
             <w:top w:w="15" w:type="dxa"/>
             <w:left w:w="15" w:type="dxa"/>
@@ -4983,7 +5047,7 @@
         <w:tc>
           <w:tcPr>
             <w:tcW w:w="0" w:type="auto"/>
-            <w:shd w:val="clear"/>
+            <w:shd w:val="clear" w:color="auto" w:fill="auto"/>
             <w:vAlign w:val="center"/>
           </w:tcPr>
           <w:p>
@@ -5018,7 +5082,7 @@
         <w:tc>
           <w:tcPr>
             <w:tcW w:w="0" w:type="auto"/>
-            <w:shd w:val="clear"/>
+            <w:shd w:val="clear" w:color="auto" w:fill="auto"/>
             <w:vAlign w:val="center"/>
           </w:tcPr>
           <w:p>
@@ -5053,7 +5117,7 @@
         <w:tc>
           <w:tcPr>
             <w:tcW w:w="0" w:type="auto"/>
-            <w:shd w:val="clear"/>
+            <w:shd w:val="clear" w:color="auto" w:fill="auto"/>
             <w:vAlign w:val="center"/>
           </w:tcPr>
           <w:p>
@@ -5096,7 +5160,7 @@
             <w:insideH w:val="none" w:color="auto" w:sz="0" w:space="0"/>
             <w:insideV w:val="none" w:color="auto" w:sz="0" w:space="0"/>
           </w:tblBorders>
-          <w:shd w:val="clear"/>
+          <w:shd w:val="clear" w:color="auto" w:fill="auto"/>
           <w:tblCellMar>
             <w:top w:w="15" w:type="dxa"/>
             <w:left w:w="15" w:type="dxa"/>
@@ -5110,7 +5174,7 @@
         <w:tc>
           <w:tcPr>
             <w:tcW w:w="0" w:type="auto"/>
-            <w:shd w:val="clear"/>
+            <w:shd w:val="clear" w:color="auto" w:fill="auto"/>
             <w:vAlign w:val="center"/>
           </w:tcPr>
           <w:p>
@@ -5141,7 +5205,7 @@
         <w:tc>
           <w:tcPr>
             <w:tcW w:w="0" w:type="auto"/>
-            <w:shd w:val="clear"/>
+            <w:shd w:val="clear" w:color="auto" w:fill="auto"/>
             <w:vAlign w:val="center"/>
           </w:tcPr>
           <w:p>
@@ -5172,7 +5236,7 @@
         <w:tc>
           <w:tcPr>
             <w:tcW w:w="0" w:type="auto"/>
-            <w:shd w:val="clear"/>
+            <w:shd w:val="clear" w:color="auto" w:fill="auto"/>
             <w:vAlign w:val="center"/>
           </w:tcPr>
           <w:p>
@@ -5211,7 +5275,7 @@
             <w:insideH w:val="none" w:color="auto" w:sz="0" w:space="0"/>
             <w:insideV w:val="none" w:color="auto" w:sz="0" w:space="0"/>
           </w:tblBorders>
-          <w:shd w:val="clear"/>
+          <w:shd w:val="clear" w:color="auto" w:fill="auto"/>
           <w:tblCellMar>
             <w:top w:w="15" w:type="dxa"/>
             <w:left w:w="15" w:type="dxa"/>
@@ -5225,7 +5289,7 @@
         <w:tc>
           <w:tcPr>
             <w:tcW w:w="0" w:type="auto"/>
-            <w:shd w:val="clear"/>
+            <w:shd w:val="clear" w:color="auto" w:fill="auto"/>
             <w:vAlign w:val="center"/>
           </w:tcPr>
           <w:p>
@@ -5256,7 +5320,7 @@
         <w:tc>
           <w:tcPr>
             <w:tcW w:w="0" w:type="auto"/>
-            <w:shd w:val="clear"/>
+            <w:shd w:val="clear" w:color="auto" w:fill="auto"/>
             <w:vAlign w:val="center"/>
           </w:tcPr>
           <w:p>
@@ -5287,7 +5351,7 @@
         <w:tc>
           <w:tcPr>
             <w:tcW w:w="0" w:type="auto"/>
-            <w:shd w:val="clear"/>
+            <w:shd w:val="clear" w:color="auto" w:fill="auto"/>
             <w:vAlign w:val="center"/>
           </w:tcPr>
           <w:p>
@@ -5388,8 +5452,6 @@
           </wp:inline>
         </w:drawing>
       </w:r>
-      <w:bookmarkStart w:id="0" w:name="_GoBack"/>
-      <w:bookmarkEnd w:id="0"/>
     </w:p>
     <w:p>
       <w:pPr>
@@ -5624,7 +5686,7 @@
             </w14:solidFill>
           </w14:textFill>
         </w:rPr>
-        <w:t xml:space="preserve"> The website uses simple and modern sans-serif fonts because they are easy to read on both desktop and mobile devices.</w:t>
+        <w:t xml:space="preserve"> The website uses simple and modern sans-serif fonts because they are easy to read on both desktop and mobile devices (Webflow, 2025).</w:t>
       </w:r>
     </w:p>
     <w:p>
@@ -5680,6 +5742,7 @@
     </w:p>
     <w:tbl>
       <w:tblPr>
+        <w:tblStyle w:val="5"/>
         <w:tblW w:w="0" w:type="auto"/>
         <w:tblCellSpacing w:w="15" w:type="dxa"/>
         <w:tblInd w:w="0" w:type="dxa"/>
@@ -5691,7 +5754,7 @@
           <w:insideH w:val="none" w:color="auto" w:sz="0" w:space="0"/>
           <w:insideV w:val="none" w:color="auto" w:sz="0" w:space="0"/>
         </w:tblBorders>
-        <w:shd w:val="clear"/>
+        <w:shd w:val="clear" w:color="auto" w:fill="auto"/>
         <w:tblLayout w:type="autofit"/>
         <w:tblCellMar>
           <w:top w:w="15" w:type="dxa"/>
@@ -5715,6 +5778,7 @@
             <w:insideH w:val="none" w:color="auto" w:sz="0" w:space="0"/>
             <w:insideV w:val="none" w:color="auto" w:sz="0" w:space="0"/>
           </w:tblBorders>
+          <w:shd w:val="clear" w:color="auto" w:fill="auto"/>
           <w:tblCellMar>
             <w:top w:w="15" w:type="dxa"/>
             <w:left w:w="15" w:type="dxa"/>
@@ -5729,7 +5793,7 @@
         <w:tc>
           <w:tcPr>
             <w:tcW w:w="0" w:type="auto"/>
-            <w:shd w:val="clear"/>
+            <w:shd w:val="clear" w:color="auto" w:fill="auto"/>
             <w:vAlign w:val="center"/>
           </w:tcPr>
           <w:p>
@@ -5764,7 +5828,7 @@
         <w:tc>
           <w:tcPr>
             <w:tcW w:w="0" w:type="auto"/>
-            <w:shd w:val="clear"/>
+            <w:shd w:val="clear" w:color="auto" w:fill="auto"/>
             <w:vAlign w:val="center"/>
           </w:tcPr>
           <w:p>
@@ -5799,7 +5863,7 @@
         <w:tc>
           <w:tcPr>
             <w:tcW w:w="0" w:type="auto"/>
-            <w:shd w:val="clear"/>
+            <w:shd w:val="clear" w:color="auto" w:fill="auto"/>
             <w:vAlign w:val="center"/>
           </w:tcPr>
           <w:p>
@@ -5842,7 +5906,7 @@
             <w:insideH w:val="none" w:color="auto" w:sz="0" w:space="0"/>
             <w:insideV w:val="none" w:color="auto" w:sz="0" w:space="0"/>
           </w:tblBorders>
-          <w:shd w:val="clear"/>
+          <w:shd w:val="clear" w:color="auto" w:fill="auto"/>
           <w:tblCellMar>
             <w:top w:w="15" w:type="dxa"/>
             <w:left w:w="15" w:type="dxa"/>
@@ -5856,7 +5920,7 @@
         <w:tc>
           <w:tcPr>
             <w:tcW w:w="0" w:type="auto"/>
-            <w:shd w:val="clear"/>
+            <w:shd w:val="clear" w:color="auto" w:fill="auto"/>
             <w:vAlign w:val="center"/>
           </w:tcPr>
           <w:p>
@@ -5887,7 +5951,7 @@
         <w:tc>
           <w:tcPr>
             <w:tcW w:w="0" w:type="auto"/>
-            <w:shd w:val="clear"/>
+            <w:shd w:val="clear" w:color="auto" w:fill="auto"/>
             <w:vAlign w:val="center"/>
           </w:tcPr>
           <w:p>
@@ -5918,7 +5982,7 @@
         <w:tc>
           <w:tcPr>
             <w:tcW w:w="0" w:type="auto"/>
-            <w:shd w:val="clear"/>
+            <w:shd w:val="clear" w:color="auto" w:fill="auto"/>
             <w:vAlign w:val="center"/>
           </w:tcPr>
           <w:p>
@@ -5957,7 +6021,7 @@
             <w:insideH w:val="none" w:color="auto" w:sz="0" w:space="0"/>
             <w:insideV w:val="none" w:color="auto" w:sz="0" w:space="0"/>
           </w:tblBorders>
-          <w:shd w:val="clear"/>
+          <w:shd w:val="clear" w:color="auto" w:fill="auto"/>
           <w:tblCellMar>
             <w:top w:w="15" w:type="dxa"/>
             <w:left w:w="15" w:type="dxa"/>
@@ -5971,7 +6035,7 @@
         <w:tc>
           <w:tcPr>
             <w:tcW w:w="0" w:type="auto"/>
-            <w:shd w:val="clear"/>
+            <w:shd w:val="clear" w:color="auto" w:fill="auto"/>
             <w:vAlign w:val="center"/>
           </w:tcPr>
           <w:p>
@@ -6002,7 +6066,7 @@
         <w:tc>
           <w:tcPr>
             <w:tcW w:w="0" w:type="auto"/>
-            <w:shd w:val="clear"/>
+            <w:shd w:val="clear" w:color="auto" w:fill="auto"/>
             <w:vAlign w:val="center"/>
           </w:tcPr>
           <w:p>
@@ -6033,7 +6097,7 @@
         <w:tc>
           <w:tcPr>
             <w:tcW w:w="0" w:type="auto"/>
-            <w:shd w:val="clear"/>
+            <w:shd w:val="clear" w:color="auto" w:fill="auto"/>
             <w:vAlign w:val="center"/>
           </w:tcPr>
           <w:p>
@@ -6072,7 +6136,7 @@
             <w:insideH w:val="none" w:color="auto" w:sz="0" w:space="0"/>
             <w:insideV w:val="none" w:color="auto" w:sz="0" w:space="0"/>
           </w:tblBorders>
-          <w:shd w:val="clear"/>
+          <w:shd w:val="clear" w:color="auto" w:fill="auto"/>
           <w:tblCellMar>
             <w:top w:w="15" w:type="dxa"/>
             <w:left w:w="15" w:type="dxa"/>
@@ -6086,7 +6150,7 @@
         <w:tc>
           <w:tcPr>
             <w:tcW w:w="0" w:type="auto"/>
-            <w:shd w:val="clear"/>
+            <w:shd w:val="clear" w:color="auto" w:fill="auto"/>
             <w:vAlign w:val="center"/>
           </w:tcPr>
           <w:p>
@@ -6117,7 +6181,7 @@
         <w:tc>
           <w:tcPr>
             <w:tcW w:w="0" w:type="auto"/>
-            <w:shd w:val="clear"/>
+            <w:shd w:val="clear" w:color="auto" w:fill="auto"/>
             <w:vAlign w:val="center"/>
           </w:tcPr>
           <w:p>
@@ -6148,7 +6212,7 @@
         <w:tc>
           <w:tcPr>
             <w:tcW w:w="0" w:type="auto"/>
-            <w:shd w:val="clear"/>
+            <w:shd w:val="clear" w:color="auto" w:fill="auto"/>
             <w:vAlign w:val="center"/>
           </w:tcPr>
           <w:p>
@@ -6788,7 +6852,7 @@
           <w:sz w:val="24"/>
           <w:szCs w:val="24"/>
         </w:rPr>
-        <w:t xml:space="preserve">Consistent spacing improves readability </w:t>
+        <w:t>Consistent spacing improves readability and enhances user experience (Interaction Design Foundation, 2025).</w:t>
       </w:r>
     </w:p>
     <w:p>
@@ -7084,6 +7148,7 @@
       <w:pPr>
         <w:pStyle w:val="12"/>
         <w:numPr>
+          <w:ilvl w:val="0"/>
           <w:numId w:val="0"/>
         </w:numPr>
         <w:spacing w:before="240" w:beforeAutospacing="0" w:after="240" w:afterAutospacing="0"/>
@@ -7100,6 +7165,7 @@
       <w:pPr>
         <w:pStyle w:val="12"/>
         <w:numPr>
+          <w:ilvl w:val="0"/>
           <w:numId w:val="0"/>
         </w:numPr>
         <w:spacing w:before="240" w:beforeAutospacing="0" w:after="240" w:afterAutospacing="0"/>
@@ -7221,8 +7287,45 @@
           <w:szCs w:val="24"/>
           <w:lang w:val="en-US"/>
         </w:rPr>
-        <w:t xml:space="preserve"> To ensure low latency, the site will use a </w:t>
-      </w:r>
+        <w:t xml:space="preserve"> To ensure low latency, the site will use a .co.za domain hosted on local South African servers through</w:t>
+      </w:r>
+      <w:r>
+        <w:rPr>
+          <w:rFonts w:hint="default" w:ascii="Times New Roman" w:hAnsi="Times New Roman" w:cs="Times New Roman"/>
+          <w:color w:val="auto"/>
+          <w:sz w:val="24"/>
+          <w:szCs w:val="24"/>
+          <w:lang w:val="en-ZA"/>
+        </w:rPr>
+        <w:t xml:space="preserve"> Xneelo</w:t>
+      </w:r>
+      <w:r>
+        <w:rPr>
+          <w:rFonts w:hint="default" w:ascii="Times New Roman" w:hAnsi="Times New Roman" w:cs="Times New Roman"/>
+          <w:color w:val="auto"/>
+          <w:sz w:val="24"/>
+          <w:szCs w:val="24"/>
+          <w:lang w:val="en-US"/>
+        </w:rPr>
+        <w:t xml:space="preserve"> (Xneelo, 2026).</w:t>
+      </w:r>
+    </w:p>
+    <w:p>
+      <w:pPr>
+        <w:pStyle w:val="12"/>
+        <w:numPr>
+          <w:ilvl w:val="0"/>
+          <w:numId w:val="6"/>
+        </w:numPr>
+        <w:spacing w:before="240" w:beforeAutospacing="0" w:after="240" w:afterAutospacing="0"/>
+        <w:rPr>
+          <w:rFonts w:hint="default" w:ascii="Times New Roman" w:hAnsi="Times New Roman" w:cs="Times New Roman"/>
+          <w:color w:val="auto"/>
+          <w:sz w:val="24"/>
+          <w:szCs w:val="24"/>
+          <w:lang w:val="en-US"/>
+        </w:rPr>
+      </w:pPr>
       <w:r>
         <w:rPr>
           <w:rFonts w:hint="default" w:ascii="Times New Roman" w:hAnsi="Times New Roman" w:cs="Times New Roman"/>
@@ -7233,18 +7336,35 @@
           <w:szCs w:val="24"/>
           <w:lang w:val="en-US"/>
         </w:rPr>
-        <w:t>.co.za</w:t>
-      </w:r>
-      <w:r>
-        <w:rPr>
-          <w:rFonts w:hint="default" w:ascii="Times New Roman" w:hAnsi="Times New Roman" w:cs="Times New Roman"/>
-          <w:color w:val="auto"/>
-          <w:sz w:val="24"/>
-          <w:szCs w:val="24"/>
-          <w:lang w:val="en-US"/>
-        </w:rPr>
-        <w:t xml:space="preserve"> domain hosted on local South African servers through </w:t>
-      </w:r>
+        <w:t>5.2 Programming Tech Stack</w:t>
+      </w:r>
+      <w:r>
+        <w:rPr>
+          <w:rFonts w:hint="default" w:ascii="Times New Roman" w:hAnsi="Times New Roman" w:cs="Times New Roman"/>
+          <w:color w:val="auto"/>
+          <w:sz w:val="24"/>
+          <w:szCs w:val="24"/>
+          <w:lang w:val="en-US"/>
+        </w:rPr>
+        <w:t xml:space="preserve"> The platform will be built using semantic HTML5, CSS Grid/Flexbox, and JavaScript for form validation (MDN Web Docs, 2025).</w:t>
+      </w:r>
+    </w:p>
+    <w:p>
+      <w:pPr>
+        <w:pStyle w:val="12"/>
+        <w:numPr>
+          <w:ilvl w:val="0"/>
+          <w:numId w:val="6"/>
+        </w:numPr>
+        <w:spacing w:before="240" w:beforeAutospacing="0" w:after="240" w:afterAutospacing="0"/>
+        <w:rPr>
+          <w:rFonts w:hint="default" w:ascii="Times New Roman" w:hAnsi="Times New Roman" w:cs="Times New Roman"/>
+          <w:color w:val="auto"/>
+          <w:sz w:val="24"/>
+          <w:szCs w:val="24"/>
+          <w:lang w:val="en-US"/>
+        </w:rPr>
+      </w:pPr>
       <w:r>
         <w:rPr>
           <w:rFonts w:hint="default" w:ascii="Times New Roman" w:hAnsi="Times New Roman" w:cs="Times New Roman"/>
@@ -7255,136 +7375,29 @@
           <w:szCs w:val="24"/>
           <w:lang w:val="en-US"/>
         </w:rPr>
-        <w:t>Xneelo</w:t>
-      </w:r>
-      <w:r>
-        <w:rPr>
-          <w:rFonts w:hint="default" w:ascii="Times New Roman" w:hAnsi="Times New Roman" w:cs="Times New Roman"/>
-          <w:color w:val="auto"/>
-          <w:sz w:val="24"/>
-          <w:szCs w:val="24"/>
-          <w:lang w:val="en-US"/>
-        </w:rPr>
-        <w:t>.</w:t>
-      </w:r>
-    </w:p>
-    <w:p>
-      <w:pPr>
-        <w:pStyle w:val="12"/>
-        <w:spacing w:before="240" w:beforeAutospacing="0" w:after="240" w:afterAutospacing="0"/>
-        <w:ind w:left="720"/>
-        <w:rPr>
-          <w:rFonts w:hint="default" w:ascii="Times New Roman" w:hAnsi="Times New Roman" w:cs="Times New Roman"/>
-          <w:color w:val="auto"/>
-          <w:sz w:val="24"/>
-          <w:szCs w:val="24"/>
-          <w:lang w:val="en-US"/>
-        </w:rPr>
-      </w:pPr>
-    </w:p>
-    <w:p>
-      <w:pPr>
-        <w:pStyle w:val="12"/>
-        <w:numPr>
-          <w:ilvl w:val="0"/>
-          <w:numId w:val="6"/>
-        </w:numPr>
-        <w:spacing w:before="240" w:beforeAutospacing="0" w:after="240" w:afterAutospacing="0"/>
-        <w:rPr>
-          <w:rFonts w:hint="default" w:ascii="Times New Roman" w:hAnsi="Times New Roman" w:cs="Times New Roman"/>
-          <w:color w:val="auto"/>
-          <w:sz w:val="24"/>
-          <w:szCs w:val="24"/>
-          <w:lang w:val="en-US"/>
-        </w:rPr>
-      </w:pPr>
-      <w:r>
-        <w:rPr>
-          <w:rFonts w:hint="default" w:ascii="Times New Roman" w:hAnsi="Times New Roman" w:cs="Times New Roman"/>
-          <w:b/>
-          <w:bCs/>
-          <w:color w:val="auto"/>
-          <w:sz w:val="24"/>
-          <w:szCs w:val="24"/>
-          <w:lang w:val="en-US"/>
-        </w:rPr>
-        <w:t>5.2 Programming Tech Stack</w:t>
-      </w:r>
-      <w:r>
-        <w:rPr>
-          <w:rFonts w:hint="default" w:ascii="Times New Roman" w:hAnsi="Times New Roman" w:cs="Times New Roman"/>
-          <w:color w:val="auto"/>
-          <w:sz w:val="24"/>
-          <w:szCs w:val="24"/>
-          <w:lang w:val="en-US"/>
-        </w:rPr>
-        <w:t xml:space="preserve"> The platform will be built using semantic </w:t>
-      </w:r>
-      <w:r>
-        <w:rPr>
-          <w:rFonts w:hint="default" w:ascii="Times New Roman" w:hAnsi="Times New Roman" w:cs="Times New Roman"/>
-          <w:b/>
-          <w:bCs/>
-          <w:color w:val="auto"/>
-          <w:sz w:val="24"/>
-          <w:szCs w:val="24"/>
-          <w:lang w:val="en-US"/>
-        </w:rPr>
-        <w:t>HTML5</w:t>
-      </w:r>
-      <w:r>
-        <w:rPr>
-          <w:rFonts w:hint="default" w:ascii="Times New Roman" w:hAnsi="Times New Roman" w:cs="Times New Roman"/>
-          <w:color w:val="auto"/>
-          <w:sz w:val="24"/>
-          <w:szCs w:val="24"/>
-          <w:lang w:val="en-US"/>
-        </w:rPr>
-        <w:t xml:space="preserve">, </w:t>
-      </w:r>
-      <w:r>
-        <w:rPr>
-          <w:rFonts w:hint="default" w:ascii="Times New Roman" w:hAnsi="Times New Roman" w:cs="Times New Roman"/>
-          <w:b/>
-          <w:bCs/>
-          <w:color w:val="auto"/>
-          <w:sz w:val="24"/>
-          <w:szCs w:val="24"/>
-          <w:lang w:val="en-US"/>
-        </w:rPr>
-        <w:t>CSS Grid/Flexbox</w:t>
-      </w:r>
-      <w:r>
-        <w:rPr>
-          <w:rFonts w:hint="default" w:ascii="Times New Roman" w:hAnsi="Times New Roman" w:cs="Times New Roman"/>
-          <w:color w:val="auto"/>
-          <w:sz w:val="24"/>
-          <w:szCs w:val="24"/>
-          <w:lang w:val="en-US"/>
-        </w:rPr>
-        <w:t xml:space="preserve">, and </w:t>
-      </w:r>
-      <w:r>
-        <w:rPr>
-          <w:rFonts w:hint="default" w:ascii="Times New Roman" w:hAnsi="Times New Roman" w:cs="Times New Roman"/>
-          <w:b/>
-          <w:bCs/>
-          <w:color w:val="auto"/>
-          <w:sz w:val="24"/>
-          <w:szCs w:val="24"/>
-          <w:lang w:val="en-US"/>
-        </w:rPr>
-        <w:t xml:space="preserve"> JavaScript</w:t>
-      </w:r>
-      <w:r>
-        <w:rPr>
-          <w:rFonts w:hint="default" w:ascii="Times New Roman" w:hAnsi="Times New Roman" w:cs="Times New Roman"/>
-          <w:color w:val="auto"/>
-          <w:sz w:val="24"/>
-          <w:szCs w:val="24"/>
-          <w:lang w:val="en-US"/>
-        </w:rPr>
-        <w:t xml:space="preserve"> for form validation.</w:t>
+        <w:t xml:space="preserve">Responsive web design </w:t>
+      </w:r>
+      <w:r>
+        <w:rPr>
+          <w:rFonts w:hint="default" w:ascii="Times New Roman" w:hAnsi="Times New Roman" w:cs="Times New Roman"/>
+          <w:b w:val="0"/>
+          <w:bCs w:val="0"/>
+          <w:color w:val="auto"/>
+          <w:sz w:val="24"/>
+          <w:szCs w:val="24"/>
+          <w:lang w:val="en-ZA"/>
+        </w:rPr>
+        <w:t>W</w:t>
+      </w:r>
+      <w:r>
+        <w:rPr>
+          <w:rFonts w:hint="default" w:ascii="Times New Roman" w:hAnsi="Times New Roman" w:cs="Times New Roman"/>
+          <w:color w:val="auto"/>
+          <w:sz w:val="24"/>
+          <w:szCs w:val="24"/>
+          <w:lang w:val="en-US"/>
+        </w:rPr>
+        <w:t>ill ensure the website functions correctly on desktops, tablets, and mobile devices (Smashing Magazine, 2025).</w:t>
       </w:r>
     </w:p>
     <w:p>
@@ -9329,6 +9342,412 @@
     <w:p>
       <w:pPr>
         <w:pStyle w:val="12"/>
+        <w:numPr>
+          <w:ilvl w:val="0"/>
+          <w:numId w:val="18"/>
+        </w:numPr>
+        <w:bidi w:val="0"/>
+        <w:spacing w:before="0" w:beforeAutospacing="0" w:after="0" w:afterAutospacing="0"/>
+        <w:rPr>
+          <w:rFonts w:hint="default" w:ascii="Times New Roman" w:hAnsi="Times New Roman" w:cs="Times New Roman"/>
+          <w:lang w:val="en-US"/>
+        </w:rPr>
+      </w:pPr>
+      <w:r>
+        <w:rPr>
+          <w:rFonts w:hint="default" w:ascii="Times New Roman" w:hAnsi="Times New Roman" w:eastAsia="SimSun" w:cs="Times New Roman"/>
+          <w:sz w:val="24"/>
+          <w:szCs w:val="24"/>
+        </w:rPr>
+        <w:t xml:space="preserve">Adobe. (2025). Principles of modern web design. Available at: https://www.adobe.com </w:t>
+      </w:r>
+      <w:r>
+        <w:rPr>
+          <w:rFonts w:hint="default" w:ascii="Times New Roman" w:hAnsi="Times New Roman" w:eastAsia="SimSun" w:cs="Times New Roman"/>
+          <w:sz w:val="24"/>
+          <w:szCs w:val="24"/>
+        </w:rPr>
+        <w:br w:type="textWrapping"/>
+      </w:r>
+      <w:r>
+        <w:rPr>
+          <w:rFonts w:hint="default" w:ascii="Times New Roman" w:hAnsi="Times New Roman" w:eastAsia="SimSun" w:cs="Times New Roman"/>
+          <w:sz w:val="24"/>
+          <w:szCs w:val="24"/>
+        </w:rPr>
+        <w:t>Accessed: April 2026.</w:t>
+      </w:r>
+    </w:p>
+    <w:p>
+      <w:pPr>
+        <w:pStyle w:val="12"/>
+        <w:numPr>
+          <w:ilvl w:val="0"/>
+          <w:numId w:val="18"/>
+        </w:numPr>
+        <w:bidi w:val="0"/>
+        <w:spacing w:before="0" w:beforeAutospacing="0" w:after="0" w:afterAutospacing="0"/>
+        <w:rPr>
+          <w:rFonts w:hint="default" w:ascii="Times New Roman" w:hAnsi="Times New Roman" w:cs="Times New Roman"/>
+          <w:lang w:val="en-US"/>
+        </w:rPr>
+      </w:pPr>
+      <w:r>
+        <w:rPr>
+          <w:rFonts w:hint="default" w:ascii="Times New Roman" w:hAnsi="Times New Roman" w:eastAsia="SimSun" w:cs="Times New Roman"/>
+          <w:sz w:val="24"/>
+          <w:szCs w:val="24"/>
+        </w:rPr>
+        <w:t xml:space="preserve">MDN Web Docs. (2025). HTML: HyperText Markup Language. Available at: https://developer.mozilla.org/en-US/docs/Web/HTML </w:t>
+      </w:r>
+      <w:r>
+        <w:rPr>
+          <w:rFonts w:hint="default" w:ascii="Times New Roman" w:hAnsi="Times New Roman" w:eastAsia="SimSun" w:cs="Times New Roman"/>
+          <w:sz w:val="24"/>
+          <w:szCs w:val="24"/>
+        </w:rPr>
+        <w:br w:type="textWrapping"/>
+      </w:r>
+      <w:r>
+        <w:rPr>
+          <w:rFonts w:hint="default" w:ascii="Times New Roman" w:hAnsi="Times New Roman" w:eastAsia="SimSun" w:cs="Times New Roman"/>
+          <w:sz w:val="24"/>
+          <w:szCs w:val="24"/>
+        </w:rPr>
+        <w:t>Accessed: April 2026.</w:t>
+      </w:r>
+    </w:p>
+    <w:p>
+      <w:pPr>
+        <w:pStyle w:val="12"/>
+        <w:numPr>
+          <w:ilvl w:val="0"/>
+          <w:numId w:val="18"/>
+        </w:numPr>
+        <w:bidi w:val="0"/>
+        <w:spacing w:before="0" w:beforeAutospacing="0" w:after="0" w:afterAutospacing="0"/>
+        <w:rPr>
+          <w:rFonts w:hint="default" w:ascii="Times New Roman" w:hAnsi="Times New Roman" w:cs="Times New Roman"/>
+          <w:lang w:val="en-US"/>
+        </w:rPr>
+      </w:pPr>
+      <w:r>
+        <w:rPr>
+          <w:rFonts w:hint="default" w:ascii="Times New Roman" w:hAnsi="Times New Roman" w:eastAsia="SimSun" w:cs="Times New Roman"/>
+          <w:sz w:val="24"/>
+          <w:szCs w:val="24"/>
+        </w:rPr>
+        <w:t xml:space="preserve">MDN Web Docs. (2025). CSS: Cascading Style Sheets. Available at: https://developer.mozilla.org/en-US/docs/Web/CSS </w:t>
+      </w:r>
+      <w:r>
+        <w:rPr>
+          <w:rFonts w:hint="default" w:ascii="Times New Roman" w:hAnsi="Times New Roman" w:eastAsia="SimSun" w:cs="Times New Roman"/>
+          <w:sz w:val="24"/>
+          <w:szCs w:val="24"/>
+        </w:rPr>
+        <w:br w:type="textWrapping"/>
+      </w:r>
+      <w:r>
+        <w:rPr>
+          <w:rFonts w:hint="default" w:ascii="Times New Roman" w:hAnsi="Times New Roman" w:eastAsia="SimSun" w:cs="Times New Roman"/>
+          <w:sz w:val="24"/>
+          <w:szCs w:val="24"/>
+        </w:rPr>
+        <w:t>Accessed: April 2026.</w:t>
+      </w:r>
+    </w:p>
+    <w:p>
+      <w:pPr>
+        <w:pStyle w:val="12"/>
+        <w:numPr>
+          <w:ilvl w:val="0"/>
+          <w:numId w:val="18"/>
+        </w:numPr>
+        <w:bidi w:val="0"/>
+        <w:spacing w:before="0" w:beforeAutospacing="0" w:after="0" w:afterAutospacing="0"/>
+        <w:rPr>
+          <w:rFonts w:hint="default" w:ascii="Times New Roman" w:hAnsi="Times New Roman" w:cs="Times New Roman"/>
+          <w:lang w:val="en-US"/>
+        </w:rPr>
+      </w:pPr>
+      <w:r>
+        <w:rPr>
+          <w:rFonts w:hint="default" w:ascii="Times New Roman" w:hAnsi="Times New Roman" w:eastAsia="SimSun" w:cs="Times New Roman"/>
+          <w:sz w:val="24"/>
+          <w:szCs w:val="24"/>
+        </w:rPr>
+        <w:t xml:space="preserve">Nielsen Norman Group. (2025). User experience basics. Available at: https://www.nngroup.com </w:t>
+      </w:r>
+      <w:r>
+        <w:rPr>
+          <w:rFonts w:hint="default" w:ascii="Times New Roman" w:hAnsi="Times New Roman" w:eastAsia="SimSun" w:cs="Times New Roman"/>
+          <w:sz w:val="24"/>
+          <w:szCs w:val="24"/>
+        </w:rPr>
+        <w:br w:type="textWrapping"/>
+      </w:r>
+      <w:r>
+        <w:rPr>
+          <w:rFonts w:hint="default" w:ascii="Times New Roman" w:hAnsi="Times New Roman" w:eastAsia="SimSun" w:cs="Times New Roman"/>
+          <w:sz w:val="24"/>
+          <w:szCs w:val="24"/>
+        </w:rPr>
+        <w:t>Accessed: April 2026.</w:t>
+      </w:r>
+    </w:p>
+    <w:p>
+      <w:pPr>
+        <w:pStyle w:val="12"/>
+        <w:numPr>
+          <w:ilvl w:val="0"/>
+          <w:numId w:val="18"/>
+        </w:numPr>
+        <w:bidi w:val="0"/>
+        <w:spacing w:before="0" w:beforeAutospacing="0" w:after="0" w:afterAutospacing="0"/>
+        <w:rPr>
+          <w:rFonts w:hint="default" w:ascii="Times New Roman" w:hAnsi="Times New Roman" w:cs="Times New Roman"/>
+          <w:lang w:val="en-US"/>
+        </w:rPr>
+      </w:pPr>
+      <w:r>
+        <w:rPr>
+          <w:rFonts w:hint="default" w:ascii="Times New Roman" w:hAnsi="Times New Roman" w:eastAsia="SimSun" w:cs="Times New Roman"/>
+          <w:sz w:val="24"/>
+          <w:szCs w:val="24"/>
+        </w:rPr>
+        <w:t xml:space="preserve">OpenAI. (2026). ChatGPT assistance for web development planning and coding support. Available at: https://openai.com/chatgpt </w:t>
+      </w:r>
+      <w:r>
+        <w:rPr>
+          <w:rFonts w:hint="default" w:ascii="Times New Roman" w:hAnsi="Times New Roman" w:eastAsia="SimSun" w:cs="Times New Roman"/>
+          <w:sz w:val="24"/>
+          <w:szCs w:val="24"/>
+        </w:rPr>
+        <w:br w:type="textWrapping"/>
+      </w:r>
+      <w:r>
+        <w:rPr>
+          <w:rFonts w:hint="default" w:ascii="Times New Roman" w:hAnsi="Times New Roman" w:eastAsia="SimSun" w:cs="Times New Roman"/>
+          <w:sz w:val="24"/>
+          <w:szCs w:val="24"/>
+        </w:rPr>
+        <w:t>Accessed: April 2026.</w:t>
+      </w:r>
+    </w:p>
+    <w:p>
+      <w:pPr>
+        <w:pStyle w:val="12"/>
+        <w:numPr>
+          <w:ilvl w:val="0"/>
+          <w:numId w:val="18"/>
+        </w:numPr>
+        <w:bidi w:val="0"/>
+        <w:spacing w:before="0" w:beforeAutospacing="0" w:after="0" w:afterAutospacing="0"/>
+        <w:rPr>
+          <w:rFonts w:hint="default" w:ascii="Times New Roman" w:hAnsi="Times New Roman" w:cs="Times New Roman"/>
+          <w:lang w:val="en-US"/>
+        </w:rPr>
+      </w:pPr>
+      <w:r>
+        <w:rPr>
+          <w:rFonts w:hint="default" w:ascii="Times New Roman" w:hAnsi="Times New Roman" w:eastAsia="SimSun" w:cs="Times New Roman"/>
+          <w:sz w:val="24"/>
+          <w:szCs w:val="24"/>
+        </w:rPr>
+        <w:t xml:space="preserve">Smashing Magazine. (2025). Responsive web design best practices. Available at: https://www.smashingmagazine.com </w:t>
+      </w:r>
+      <w:r>
+        <w:rPr>
+          <w:rFonts w:hint="default" w:ascii="Times New Roman" w:hAnsi="Times New Roman" w:eastAsia="SimSun" w:cs="Times New Roman"/>
+          <w:sz w:val="24"/>
+          <w:szCs w:val="24"/>
+        </w:rPr>
+        <w:br w:type="textWrapping"/>
+      </w:r>
+      <w:r>
+        <w:rPr>
+          <w:rFonts w:hint="default" w:ascii="Times New Roman" w:hAnsi="Times New Roman" w:eastAsia="SimSun" w:cs="Times New Roman"/>
+          <w:sz w:val="24"/>
+          <w:szCs w:val="24"/>
+        </w:rPr>
+        <w:t>Accessed: April 2026.</w:t>
+      </w:r>
+    </w:p>
+    <w:p>
+      <w:pPr>
+        <w:pStyle w:val="12"/>
+        <w:numPr>
+          <w:ilvl w:val="0"/>
+          <w:numId w:val="18"/>
+        </w:numPr>
+        <w:bidi w:val="0"/>
+        <w:spacing w:before="0" w:beforeAutospacing="0" w:after="0" w:afterAutospacing="0"/>
+        <w:rPr>
+          <w:rFonts w:hint="default" w:ascii="Times New Roman" w:hAnsi="Times New Roman" w:cs="Times New Roman"/>
+          <w:lang w:val="en-US"/>
+        </w:rPr>
+      </w:pPr>
+      <w:r>
+        <w:rPr>
+          <w:rFonts w:hint="default" w:ascii="Times New Roman" w:hAnsi="Times New Roman" w:eastAsia="SimSun" w:cs="Times New Roman"/>
+          <w:sz w:val="24"/>
+          <w:szCs w:val="24"/>
+        </w:rPr>
+        <w:t xml:space="preserve">Statista. (2025). On-demand economy trends in South Africa. Available at: https://www.statista.com </w:t>
+      </w:r>
+      <w:r>
+        <w:rPr>
+          <w:rFonts w:hint="default" w:ascii="Times New Roman" w:hAnsi="Times New Roman" w:eastAsia="SimSun" w:cs="Times New Roman"/>
+          <w:sz w:val="24"/>
+          <w:szCs w:val="24"/>
+        </w:rPr>
+        <w:br w:type="textWrapping"/>
+      </w:r>
+      <w:r>
+        <w:rPr>
+          <w:rFonts w:hint="default" w:ascii="Times New Roman" w:hAnsi="Times New Roman" w:eastAsia="SimSun" w:cs="Times New Roman"/>
+          <w:sz w:val="24"/>
+          <w:szCs w:val="24"/>
+        </w:rPr>
+        <w:t>(Search: “on-demand economy South Africa”)</w:t>
+      </w:r>
+      <w:r>
+        <w:rPr>
+          <w:rFonts w:hint="default" w:ascii="Times New Roman" w:hAnsi="Times New Roman" w:eastAsia="SimSun" w:cs="Times New Roman"/>
+          <w:sz w:val="24"/>
+          <w:szCs w:val="24"/>
+        </w:rPr>
+        <w:br w:type="textWrapping"/>
+      </w:r>
+      <w:r>
+        <w:rPr>
+          <w:rFonts w:hint="default" w:ascii="Times New Roman" w:hAnsi="Times New Roman" w:eastAsia="SimSun" w:cs="Times New Roman"/>
+          <w:sz w:val="24"/>
+          <w:szCs w:val="24"/>
+        </w:rPr>
+        <w:t>Accessed: April 2026.</w:t>
+      </w:r>
+    </w:p>
+    <w:p>
+      <w:pPr>
+        <w:pStyle w:val="12"/>
+        <w:numPr>
+          <w:ilvl w:val="0"/>
+          <w:numId w:val="18"/>
+        </w:numPr>
+        <w:bidi w:val="0"/>
+        <w:spacing w:before="0" w:beforeAutospacing="0" w:after="0" w:afterAutospacing="0"/>
+        <w:rPr>
+          <w:rFonts w:hint="default" w:ascii="Times New Roman" w:hAnsi="Times New Roman" w:cs="Times New Roman"/>
+          <w:lang w:val="en-US"/>
+        </w:rPr>
+      </w:pPr>
+      <w:r>
+        <w:rPr>
+          <w:rFonts w:hint="default" w:ascii="Times New Roman" w:hAnsi="Times New Roman" w:eastAsia="SimSun" w:cs="Times New Roman"/>
+          <w:sz w:val="24"/>
+          <w:szCs w:val="24"/>
+        </w:rPr>
+        <w:t xml:space="preserve">W3Schools. (2025). HTML and CSS tutorials. Available at: https://www.w3schools.com </w:t>
+      </w:r>
+      <w:r>
+        <w:rPr>
+          <w:rFonts w:hint="default" w:ascii="Times New Roman" w:hAnsi="Times New Roman" w:eastAsia="SimSun" w:cs="Times New Roman"/>
+          <w:sz w:val="24"/>
+          <w:szCs w:val="24"/>
+        </w:rPr>
+        <w:br w:type="textWrapping"/>
+      </w:r>
+      <w:r>
+        <w:rPr>
+          <w:rFonts w:hint="default" w:ascii="Times New Roman" w:hAnsi="Times New Roman" w:eastAsia="SimSun" w:cs="Times New Roman"/>
+          <w:sz w:val="24"/>
+          <w:szCs w:val="24"/>
+        </w:rPr>
+        <w:t>Accessed: April 2026.</w:t>
+      </w:r>
+    </w:p>
+    <w:p>
+      <w:pPr>
+        <w:pStyle w:val="12"/>
+        <w:numPr>
+          <w:ilvl w:val="0"/>
+          <w:numId w:val="18"/>
+        </w:numPr>
+        <w:bidi w:val="0"/>
+        <w:spacing w:before="0" w:beforeAutospacing="0" w:after="0" w:afterAutospacing="0"/>
+        <w:rPr>
+          <w:rFonts w:hint="default" w:ascii="Times New Roman" w:hAnsi="Times New Roman" w:cs="Times New Roman"/>
+          <w:lang w:val="en-US"/>
+        </w:rPr>
+      </w:pPr>
+      <w:r>
+        <w:rPr>
+          <w:rFonts w:hint="default" w:ascii="Times New Roman" w:hAnsi="Times New Roman" w:eastAsia="SimSun" w:cs="Times New Roman"/>
+          <w:sz w:val="24"/>
+          <w:szCs w:val="24"/>
+        </w:rPr>
+        <w:t xml:space="preserve">Webflow. (2025). Modern typography in website design. Available at: https://webflow.com/blog/typography-in-web-design </w:t>
+      </w:r>
+      <w:r>
+        <w:rPr>
+          <w:rFonts w:hint="default" w:ascii="Times New Roman" w:hAnsi="Times New Roman" w:eastAsia="SimSun" w:cs="Times New Roman"/>
+          <w:sz w:val="24"/>
+          <w:szCs w:val="24"/>
+        </w:rPr>
+        <w:br w:type="textWrapping"/>
+      </w:r>
+      <w:r>
+        <w:rPr>
+          <w:rFonts w:hint="default" w:ascii="Times New Roman" w:hAnsi="Times New Roman" w:eastAsia="SimSun" w:cs="Times New Roman"/>
+          <w:sz w:val="24"/>
+          <w:szCs w:val="24"/>
+        </w:rPr>
+        <w:t>Accessed: April 2026.</w:t>
+      </w:r>
+    </w:p>
+    <w:p>
+      <w:pPr>
+        <w:pStyle w:val="12"/>
+        <w:numPr>
+          <w:ilvl w:val="0"/>
+          <w:numId w:val="18"/>
+        </w:numPr>
+        <w:bidi w:val="0"/>
+        <w:spacing w:before="0" w:beforeAutospacing="0" w:after="0" w:afterAutospacing="0"/>
+        <w:rPr>
+          <w:rFonts w:hint="default" w:ascii="Times New Roman" w:hAnsi="Times New Roman" w:cs="Times New Roman"/>
+          <w:lang w:val="en-US"/>
+        </w:rPr>
+      </w:pPr>
+      <w:r>
+        <w:rPr>
+          <w:rFonts w:hint="default" w:ascii="Times New Roman" w:hAnsi="Times New Roman" w:eastAsia="SimSun" w:cs="Times New Roman"/>
+          <w:sz w:val="24"/>
+          <w:szCs w:val="24"/>
+        </w:rPr>
+        <w:t xml:space="preserve">Google Fonts. (2025). Poppins, Open Sans and Montserrat font families. Available at: https://fonts.google.com </w:t>
+      </w:r>
+      <w:r>
+        <w:rPr>
+          <w:rFonts w:hint="default" w:ascii="Times New Roman" w:hAnsi="Times New Roman" w:eastAsia="SimSun" w:cs="Times New Roman"/>
+          <w:sz w:val="24"/>
+          <w:szCs w:val="24"/>
+        </w:rPr>
+        <w:br w:type="textWrapping"/>
+      </w:r>
+      <w:r>
+        <w:rPr>
+          <w:rFonts w:hint="default" w:ascii="Times New Roman" w:hAnsi="Times New Roman" w:eastAsia="SimSun" w:cs="Times New Roman"/>
+          <w:sz w:val="24"/>
+          <w:szCs w:val="24"/>
+        </w:rPr>
+        <w:t>Accessed: April 2026.</w:t>
+      </w:r>
+    </w:p>
+    <w:p>
+      <w:pPr>
+        <w:pStyle w:val="12"/>
         <w:bidi w:val="0"/>
         <w:spacing w:before="240" w:beforeAutospacing="0" w:after="240" w:afterAutospacing="0"/>
         <w:ind w:left="720"/>
@@ -9352,6 +9771,8 @@
           <w:lang w:val="en-US"/>
         </w:rPr>
       </w:pPr>
+      <w:bookmarkStart w:id="0" w:name="_GoBack"/>
+      <w:bookmarkEnd w:id="0"/>
     </w:p>
     <w:p>
       <w:pPr>
@@ -12012,6 +12433,7 @@
       <w:jc w:val="left"/>
     </w:pPr>
     <w:rPr>
+      <w:rFonts w:ascii="Times New Roman" w:hAnsi="Times New Roman" w:eastAsia="SimSun" w:cs="Times New Roman"/>
       <w:kern w:val="0"/>
       <w:sz w:val="24"/>
       <w:szCs w:val="24"/>

</xml_diff>